<commit_message>
Update markets PO resume from MoexMvp dashboard brief
Co-authored-by: dimonix2019 <dimonix2019@users.noreply.github.com>
</commit_message>
<xml_diff>
--- a/Abramov_DN_resume_PO_markets.docx
+++ b/Abramov_DN_resume_PO_markets.docx
@@ -219,12 +219,38 @@
       </w:pPr>
       <w:r>
         <w:rPr>
-          <w:rFonts w:ascii="Arial" w:hAnsi="Arial" w:eastAsia="Arial"/>
+          <w:rFonts w:ascii="Arial" w:eastAsia="Arial" w:hAnsi="Arial"/>
           <w:b/>
           <w:color w:val="222222"/>
           <w:sz w:val="24"/>
+          <w:lang w:val="ru-RU"/>
         </w:rPr>
         <w:t>Менеджер продукта (PO) аналитических и торговых систем / prop-desk (фондовый рынок)</w:t>
+      </w:r>
+      <w:r>
+        <w:rPr>
+          <w:rFonts w:ascii="Arial" w:eastAsia="Arial" w:hAnsi="Arial"/>
+          <w:b/>
+          <w:color w:val="222222"/>
+          <w:sz w:val="24"/>
+        </w:rPr>
+      </w:r>
+      <w:r>
+        <w:rPr>
+          <w:rFonts w:ascii="Arial" w:eastAsia="Arial" w:hAnsi="Arial"/>
+          <w:b/>
+          <w:color w:val="222222"/>
+          <w:sz w:val="24"/>
+          <w:lang w:val="ru-RU"/>
+        </w:rPr>
+      </w:r>
+      <w:r>
+        <w:rPr>
+          <w:rFonts w:ascii="Arial" w:eastAsia="Arial" w:hAnsi="Arial"/>
+          <w:b/>
+          <w:color w:val="222222"/>
+          <w:sz w:val="24"/>
+        </w:rPr>
       </w:r>
     </w:p>
     <w:p>
@@ -3210,109 +3236,61 @@
       </w:r>
     </w:p>
     <w:p>
-      <w:pPr>
-        <w:pBdr>
-          <w:bottom w:val="single" w:sz="12" w:space="4" w:color="CCCCCC"/>
-        </w:pBdr>
-      </w:pPr>
-      <w:r>
-        <w:rPr>
-          <w:rFonts w:ascii="Arial" w:hAnsi="Arial" w:eastAsia="Arial"/>
-          <w:b/>
-          <w:color w:val="222222"/>
-          <w:sz w:val="26"/>
-        </w:rPr>
+      <w:r>
         <w:t>Проекты</w:t>
       </w:r>
     </w:p>
     <w:p>
       <w:r>
-        <w:rPr>
-          <w:rFonts w:ascii="Arial" w:hAnsi="Arial" w:eastAsia="Arial"/>
-          <w:b/>
-          <w:color w:val="222222"/>
-          <w:sz w:val="20"/>
-        </w:rPr>
         <w:t>2024 — настоящее время</w:t>
       </w:r>
     </w:p>
     <w:p>
       <w:r>
-        <w:rPr>
-          <w:rFonts w:ascii="Arial" w:hAnsi="Arial" w:eastAsia="Arial"/>
-          <w:b/>
-          <w:color w:val="222222"/>
-          <w:sz w:val="21"/>
-        </w:rPr>
-        <w:t>MoexMvp / strategy-web — prop-desk парного арбитража MOEX (TATN / TATNP)</w:t>
+        <w:t>MoexMvp / strategy-web — веб-дашборд парного арбитража акций MOEX (TATN vs TATNP)</w:t>
       </w:r>
     </w:p>
     <w:p>
       <w:r>
-        <w:rPr>
-          <w:rFonts w:ascii="Arial" w:hAnsi="Arial" w:eastAsia="Arial"/>
-          <w:b w:val="0"/>
-          <w:color w:val="222222"/>
-          <w:sz w:val="20"/>
-        </w:rPr>
-        <w:t>Sole / primary builder: дизайн desk, стратегия, live engine, testing UX, parity tooling.</w:t>
+        <w:t>Sole / primary builder: дизайн desk, стратегия, live engine, testing UX, parity tooling, брокерский контур.</w:t>
       </w:r>
     </w:p>
     <w:p>
       <w:r>
-        <w:rPr>
-          <w:rFonts w:ascii="Arial" w:hAnsi="Arial" w:eastAsia="Arial"/>
-          <w:b w:val="0"/>
-          <w:color w:val="222222"/>
-          <w:sz w:val="20"/>
-        </w:rPr>
-        <w:t>• Live trade desk: Z-score / спред, чеклист условий входа-выхода, AUTO-монитор, параметры (пороги Z, плечо, депозит, TP), открытая позиция, прогноз PnL (комиссии, overnight, bid/ask), история сделок.</w:t>
+        <w:t>• «Торговля» (Prod trade desk): live Z-score / спред, чеклист условий входа-выхода, AUTO-монитор, параметры (пороги Z, плечо, депозит, ТП), открытая позиция, прогноз PnL после закрытия (комиссии, overnight, bid/ask), история сделок; paper/prod execution path (Tinkoff Invest API).</w:t>
       </w:r>
     </w:p>
     <w:p>
       <w:r>
-        <w:rPr>
-          <w:rFonts w:ascii="Arial" w:hAnsi="Arial" w:eastAsia="Arial"/>
-          <w:b w:val="0"/>
-          <w:color w:val="222222"/>
-          <w:sz w:val="20"/>
-        </w:rPr>
-        <w:t>• Research / Testing: bar-replay, heatmap порогов Z, equity/PnL, Cap ON/OFF, slip, TP 1/2/3%, режимы M15 close и «касание» 1м tip-Z.</w:t>
+        <w:t>• «Тестирование»: bar-replay / симуляция на истории; heatmap порогов Z; equity/PnL и таблица сделок; Cap ON/OFF, slip, TP 1/2/3%; режимы M15 close vs «касание 1м» (tip-Z).</w:t>
       </w:r>
     </w:p>
     <w:p>
       <w:r>
-        <w:rPr>
-          <w:rFonts w:ascii="Arial" w:hAnsi="Arial" w:eastAsia="Arial"/>
-          <w:b w:val="0"/>
-          <w:color w:val="222222"/>
-          <w:sz w:val="20"/>
-        </w:rPr>
-        <w:t>• Паритет Test↔Prod: сверка сигналов/сделок, decision_bars (заморозка OHLC/Z в момент решения), hourly digests.</w:t>
+        <w:t>• Паритет Test↔Prod: сверка сигналов/сделок, hourly digests, decision_bars (заморозка OHLC/Z в момент решения) — backtest без «рисования» входов задним числом.</w:t>
       </w:r>
     </w:p>
     <w:p>
       <w:r>
-        <w:rPr>
-          <w:rFonts w:ascii="Arial" w:hAnsi="Arial" w:eastAsia="Arial"/>
-          <w:b w:val="0"/>
-          <w:color w:val="222222"/>
-          <w:sz w:val="20"/>
-        </w:rPr>
-        <w:t>• Стратегия: mean-reversion по Z-score спреда; учёт slip, комиссии, overnight; режимы спреда (узкий / широкий / переход) в UI.</w:t>
+        <w:t>• Стратегия: mean-reversion по Z-score спреда TATN−TATNP (rolling μ/σ ~30д); вход/выход ±entry / ±exit (prod по умолчанию ±1.6 / ±1.3); эволюция closed M15 + settle → tip1m «касание порога»; учёт slip, комиссии ~0.04%/сторона, overnight ~0.033%/день; аналитика бимодального спреда (узкий / широкий / переход) в UI.</w:t>
       </w:r>
     </w:p>
     <w:p>
       <w:r>
-        <w:rPr>
-          <w:rFonts w:ascii="Arial" w:hAnsi="Arial" w:eastAsia="Arial"/>
-          <w:b w:val="0"/>
-          <w:color w:val="222222"/>
-          <w:sz w:val="20"/>
-        </w:rPr>
-        <w:t>• Стек: Python (FastAPI) live engine + watchdog; MOEX ISS (M15 из 10м + 1м tip); SQLite; vanilla JS + Lightweight Charts; Tinkoff Invest API; Android WebView companion.</w:t>
+        <w:t>• Инженерия и observability: ISS market data (M15 из 10м + 1м tip), SQLite (replay + live_trading.db), health и checklist gating (session/broker/edge), Android WebView companion + rolling debug APK.</w:t>
       </w:r>
     </w:p>
+    <w:p>
+      <w:r>
+        <w:t>• Стек: Python (FastAPI/uvicorn) live engine + Windows-служба watchdog; vanilla JS + Lightweight Charts (не React); Tinkoff Invest API (sandbox/prod).</w:t>
+      </w:r>
+    </w:p>
+    <w:p>
+      <w:r>
+        <w:t>One-liner: Built a full-stack MOEX pairs-trading desk (Python live engine + JS research/trading UI): Z-score mean-reversion on TATN/TATNP, 1m tip execution, backtest heatmap, Test↔Prod parity, and Tinkoff broker integration.</w:t>
+      </w:r>
+    </w:p>
+    <w:p/>
     <w:p>
       <w:pPr>
         <w:pBdr>
@@ -4540,12 +4518,299 @@
       </w:pPr>
       <w:r>
         <w:rPr>
-          <w:rFonts w:ascii="Arial" w:hAnsi="Arial" w:eastAsia="Arial"/>
-          <w:b w:val="0"/>
-          <w:color w:val="222222"/>
-          <w:sz w:val="20"/>
-        </w:rPr>
-        <w:t>Product ownership  ·  Prop-desk / trading UI  ·  Парный арбитраж  ·  Z-score / mean-reversion  ·  Backtest &amp; live parity  ·  Market data pipeline  ·  BI / дашборды  ·  QlikView / QlikSense  ·  Мониторинг процессов  ·  KPI / метрики  ·  Discovery  ·  Python  ·  FastAPI  ·  JS + Lightweight Charts  ·  SQLite  ·  Tinkoff Invest API  ·  Android WebView  ·  CI/CD  ·  DWH  ·  Observability  ·  Jira / Confluence  ·  Agile  ·  MS Excel  ·  Проведение презентаций</w:t>
+          <w:rFonts w:ascii="Arial" w:eastAsia="Arial" w:hAnsi="Arial"/>
+          <w:color w:val="222222"/>
+          <w:sz w:val="20"/>
+        </w:rPr>
+        <w:t>Product ownership  ·  Prop-desk / trading desk  ·  Парный арбитраж (MOEX)  ·  Z-score / mean-reversion  ·  Live trading monitor  ·  Backtest &amp; Test↔Prod parity  ·  Market data (MOEX ISS)  ·  Research UI (replay, heatmap, equity)  ·  Tinkoff Invest API  ·  Python / FastAPI  ·  Lightweight Charts  ·  BI / дашборды  ·  QlikView / QlikSense  ·  Мониторинг процессов  ·  Discovery → метрики → UI → обратная связь  ·  Roadmap / бэклог  ·  DWH / витрины данных  ·  SQL  ·  Agile / Scrum</w:t>
+      </w:r>
+      <w:r>
+        <w:rPr>
+          <w:rFonts w:ascii="Arial" w:eastAsia="Arial" w:hAnsi="Arial"/>
+          <w:color w:val="222222"/>
+          <w:sz w:val="20"/>
+          <w:lang w:val="ru-RU"/>
+        </w:rPr>
+      </w:r>
+      <w:proofErr w:type="gramStart"/>
+      <w:r>
+        <w:rPr>
+          <w:rFonts w:ascii="Arial" w:eastAsia="Arial" w:hAnsi="Arial"/>
+          <w:color w:val="222222"/>
+          <w:sz w:val="20"/>
+        </w:rPr>
+      </w:r>
+      <w:r>
+        <w:rPr>
+          <w:rFonts w:ascii="Arial" w:eastAsia="Arial" w:hAnsi="Arial"/>
+          <w:color w:val="222222"/>
+          <w:sz w:val="20"/>
+          <w:lang w:val="ru-RU"/>
+        </w:rPr>
+      </w:r>
+      <w:proofErr w:type="gramEnd"/>
+      <w:r>
+        <w:rPr>
+          <w:rFonts w:ascii="Arial" w:eastAsia="Arial" w:hAnsi="Arial"/>
+          <w:color w:val="222222"/>
+          <w:sz w:val="20"/>
+          <w:lang w:val="ru-RU"/>
+        </w:rPr>
+      </w:r>
+      <w:r>
+        <w:rPr>
+          <w:rFonts w:ascii="Arial" w:eastAsia="Arial" w:hAnsi="Arial"/>
+          <w:color w:val="222222"/>
+          <w:sz w:val="20"/>
+        </w:rPr>
+      </w:r>
+      <w:r>
+        <w:rPr>
+          <w:rFonts w:ascii="Arial" w:eastAsia="Arial" w:hAnsi="Arial"/>
+          <w:color w:val="222222"/>
+          <w:sz w:val="20"/>
+          <w:lang w:val="ru-RU"/>
+        </w:rPr>
+      </w:r>
+      <w:r>
+        <w:rPr>
+          <w:rFonts w:ascii="Arial" w:eastAsia="Arial" w:hAnsi="Arial"/>
+          <w:color w:val="222222"/>
+          <w:sz w:val="20"/>
+        </w:rPr>
+      </w:r>
+      <w:r>
+        <w:rPr>
+          <w:rFonts w:ascii="Arial" w:eastAsia="Arial" w:hAnsi="Arial"/>
+          <w:color w:val="222222"/>
+          <w:sz w:val="20"/>
+          <w:lang w:val="ru-RU"/>
+        </w:rPr>
+      </w:r>
+      <w:r>
+        <w:rPr>
+          <w:rFonts w:ascii="Arial" w:eastAsia="Arial" w:hAnsi="Arial"/>
+          <w:color w:val="222222"/>
+          <w:sz w:val="20"/>
+        </w:rPr>
+      </w:r>
+      <w:r>
+        <w:rPr>
+          <w:rFonts w:ascii="Arial" w:eastAsia="Arial" w:hAnsi="Arial"/>
+          <w:color w:val="222222"/>
+          <w:sz w:val="20"/>
+          <w:lang w:val="ru-RU"/>
+        </w:rPr>
+      </w:r>
+      <w:r>
+        <w:rPr>
+          <w:rFonts w:ascii="Arial" w:eastAsia="Arial" w:hAnsi="Arial"/>
+          <w:color w:val="222222"/>
+          <w:sz w:val="20"/>
+        </w:rPr>
+      </w:r>
+      <w:r>
+        <w:rPr>
+          <w:rFonts w:ascii="Arial" w:eastAsia="Arial" w:hAnsi="Arial"/>
+          <w:color w:val="222222"/>
+          <w:sz w:val="20"/>
+          <w:lang w:val="ru-RU"/>
+        </w:rPr>
+      </w:r>
+      <w:r>
+        <w:rPr>
+          <w:rFonts w:ascii="Arial" w:eastAsia="Arial" w:hAnsi="Arial"/>
+          <w:color w:val="222222"/>
+          <w:sz w:val="20"/>
+        </w:rPr>
+      </w:r>
+      <w:r>
+        <w:rPr>
+          <w:rFonts w:ascii="Arial" w:eastAsia="Arial" w:hAnsi="Arial"/>
+          <w:color w:val="222222"/>
+          <w:sz w:val="20"/>
+          <w:lang w:val="ru-RU"/>
+        </w:rPr>
+      </w:r>
+      <w:r>
+        <w:rPr>
+          <w:rFonts w:ascii="Arial" w:eastAsia="Arial" w:hAnsi="Arial"/>
+          <w:color w:val="222222"/>
+          <w:sz w:val="20"/>
+        </w:rPr>
+      </w:r>
+      <w:r>
+        <w:rPr>
+          <w:rFonts w:ascii="Arial" w:eastAsia="Arial" w:hAnsi="Arial"/>
+          <w:color w:val="222222"/>
+          <w:sz w:val="20"/>
+          <w:lang w:val="ru-RU"/>
+        </w:rPr>
+      </w:r>
+      <w:r>
+        <w:rPr>
+          <w:rFonts w:ascii="Arial" w:eastAsia="Arial" w:hAnsi="Arial"/>
+          <w:color w:val="222222"/>
+          <w:sz w:val="20"/>
+        </w:rPr>
+      </w:r>
+      <w:r>
+        <w:rPr>
+          <w:rFonts w:ascii="Arial" w:eastAsia="Arial" w:hAnsi="Arial"/>
+          <w:color w:val="222222"/>
+          <w:sz w:val="20"/>
+          <w:lang w:val="ru-RU"/>
+        </w:rPr>
+      </w:r>
+      <w:r>
+        <w:rPr>
+          <w:rFonts w:ascii="Arial" w:eastAsia="Arial" w:hAnsi="Arial"/>
+          <w:color w:val="222222"/>
+          <w:sz w:val="20"/>
+        </w:rPr>
+      </w:r>
+      <w:r>
+        <w:rPr>
+          <w:rFonts w:ascii="Arial" w:eastAsia="Arial" w:hAnsi="Arial"/>
+          <w:color w:val="222222"/>
+          <w:sz w:val="20"/>
+          <w:lang w:val="ru-RU"/>
+        </w:rPr>
+      </w:r>
+      <w:r>
+        <w:rPr>
+          <w:rFonts w:ascii="Arial" w:eastAsia="Arial" w:hAnsi="Arial"/>
+          <w:color w:val="222222"/>
+          <w:sz w:val="20"/>
+        </w:rPr>
+      </w:r>
+      <w:r>
+        <w:rPr>
+          <w:rFonts w:ascii="Arial" w:eastAsia="Arial" w:hAnsi="Arial"/>
+          <w:color w:val="222222"/>
+          <w:sz w:val="20"/>
+          <w:lang w:val="ru-RU"/>
+        </w:rPr>
+      </w:r>
+      <w:r>
+        <w:rPr>
+          <w:rFonts w:ascii="Arial" w:eastAsia="Arial" w:hAnsi="Arial"/>
+          <w:color w:val="222222"/>
+          <w:sz w:val="20"/>
+        </w:rPr>
+      </w:r>
+      <w:r>
+        <w:rPr>
+          <w:rFonts w:ascii="Arial" w:eastAsia="Arial" w:hAnsi="Arial"/>
+          <w:color w:val="222222"/>
+          <w:sz w:val="20"/>
+          <w:lang w:val="ru-RU"/>
+        </w:rPr>
+      </w:r>
+      <w:r>
+        <w:rPr>
+          <w:rFonts w:ascii="Arial" w:eastAsia="Arial" w:hAnsi="Arial"/>
+          <w:color w:val="222222"/>
+          <w:sz w:val="20"/>
+        </w:rPr>
+      </w:r>
+      <w:r>
+        <w:rPr>
+          <w:rFonts w:ascii="Arial" w:eastAsia="Arial" w:hAnsi="Arial"/>
+          <w:color w:val="222222"/>
+          <w:sz w:val="20"/>
+          <w:lang w:val="ru-RU"/>
+        </w:rPr>
+      </w:r>
+      <w:r>
+        <w:rPr>
+          <w:rFonts w:ascii="Arial" w:eastAsia="Arial" w:hAnsi="Arial"/>
+          <w:color w:val="222222"/>
+          <w:sz w:val="20"/>
+        </w:rPr>
+      </w:r>
+      <w:r>
+        <w:rPr>
+          <w:rFonts w:ascii="Arial" w:eastAsia="Arial" w:hAnsi="Arial"/>
+          <w:color w:val="222222"/>
+          <w:sz w:val="20"/>
+          <w:lang w:val="ru-RU"/>
+        </w:rPr>
+      </w:r>
+      <w:r>
+        <w:rPr>
+          <w:rFonts w:ascii="Arial" w:eastAsia="Arial" w:hAnsi="Arial"/>
+          <w:color w:val="222222"/>
+          <w:sz w:val="20"/>
+        </w:rPr>
+      </w:r>
+      <w:r>
+        <w:rPr>
+          <w:rFonts w:ascii="Arial" w:eastAsia="Arial" w:hAnsi="Arial"/>
+          <w:color w:val="222222"/>
+          <w:sz w:val="20"/>
+          <w:lang w:val="ru-RU"/>
+        </w:rPr>
+      </w:r>
+      <w:r>
+        <w:rPr>
+          <w:rFonts w:ascii="Arial" w:eastAsia="Arial" w:hAnsi="Arial"/>
+          <w:color w:val="222222"/>
+          <w:sz w:val="20"/>
+        </w:rPr>
+      </w:r>
+      <w:r>
+        <w:rPr>
+          <w:rFonts w:ascii="Arial" w:eastAsia="Arial" w:hAnsi="Arial"/>
+          <w:color w:val="222222"/>
+          <w:sz w:val="20"/>
+          <w:lang w:val="ru-RU"/>
+        </w:rPr>
+      </w:r>
+      <w:r>
+        <w:rPr>
+          <w:rFonts w:ascii="Arial" w:eastAsia="Arial" w:hAnsi="Arial"/>
+          <w:color w:val="222222"/>
+          <w:sz w:val="20"/>
+        </w:rPr>
+      </w:r>
+      <w:r>
+        <w:rPr>
+          <w:rFonts w:ascii="Arial" w:eastAsia="Arial" w:hAnsi="Arial"/>
+          <w:color w:val="222222"/>
+          <w:sz w:val="20"/>
+          <w:lang w:val="ru-RU"/>
+        </w:rPr>
+      </w:r>
+      <w:r>
+        <w:rPr>
+          <w:rFonts w:ascii="Arial" w:eastAsia="Arial" w:hAnsi="Arial"/>
+          <w:color w:val="222222"/>
+          <w:sz w:val="20"/>
+        </w:rPr>
+      </w:r>
+      <w:r>
+        <w:rPr>
+          <w:rFonts w:ascii="Arial" w:eastAsia="Arial" w:hAnsi="Arial"/>
+          <w:color w:val="222222"/>
+          <w:sz w:val="20"/>
+          <w:lang w:val="ru-RU"/>
+        </w:rPr>
+      </w:r>
+      <w:r>
+        <w:rPr>
+          <w:rFonts w:ascii="Arial" w:eastAsia="Arial" w:hAnsi="Arial"/>
+          <w:color w:val="222222"/>
+          <w:sz w:val="20"/>
+        </w:rPr>
+      </w:r>
+      <w:r>
+        <w:rPr>
+          <w:rFonts w:ascii="Arial" w:eastAsia="Arial" w:hAnsi="Arial"/>
+          <w:color w:val="222222"/>
+          <w:sz w:val="20"/>
+          <w:lang w:val="ru-RU"/>
+        </w:rPr>
       </w:r>
     </w:p>
     <w:p>
@@ -4659,12 +4924,177 @@
       </w:pPr>
       <w:r>
         <w:rPr>
-          <w:rFonts w:ascii="Arial" w:hAnsi="Arial" w:eastAsia="Arial"/>
-          <w:b w:val="0"/>
+          <w:rFonts w:ascii="Arial" w:eastAsia="Arial" w:hAnsi="Arial"/>
           <w:color w:val="222222"/>
           <w:sz w:val="21"/>
-        </w:rPr>
-        <w:t>Менеджер продукта аналитических и торговых систем на фондовом рынке. Полный цикл продукта: гипотеза и метрики стратегии → research/trading UI → live-контур → обратная связь по сделкам и паритету test/prod. Собственный продукт — веб-дашборд парного арбитража MOEX (prop-desk): live Z-score/спред, чеклист входа-выхода, AUTO-монитор, bar-replay и heatmap порогов, паритет Test↔Prod, интеграция с брокером. Корпоративный бэкграунд: BI и мониторинг процессов (SberData, CSI, E2E-дашборды), системы управленческой отчётности с моделями ИИ (Axenix), платформа DWH (контуры загрузки, CI/CD, архитектура, ИБ).</w:t>
+          <w:lang w:val="ru-RU"/>
+        </w:rPr>
+        <w:t>Менеджер продукта аналитических и торговых систем на фондовом рынке. Sole / primary builder prop-desk парного арбитража MOEX (TATN vs TATNP): гипотеза и метрики стратегии → research/trading UI → live-контур исполнения → паритет backtest↔prod и обратная связь по сделкам. Опыт корпоративной аналитики (управленческая отчётность, BI, мониторинг процессов) и платформенных данных (DWH) переношу в продукт торгового стола: понятный desk, проверяемые решения, observability.</w:t>
+      </w:r>
+      <w:r>
+        <w:rPr>
+          <w:rFonts w:ascii="Arial" w:eastAsia="Arial" w:hAnsi="Arial"/>
+          <w:color w:val="222222"/>
+          <w:sz w:val="21"/>
+        </w:rPr>
+      </w:r>
+      <w:r>
+        <w:rPr>
+          <w:rFonts w:ascii="Arial" w:eastAsia="Arial" w:hAnsi="Arial"/>
+          <w:color w:val="222222"/>
+          <w:sz w:val="21"/>
+          <w:lang w:val="ru-RU"/>
+        </w:rPr>
+      </w:r>
+      <w:r>
+        <w:rPr>
+          <w:rFonts w:ascii="Arial" w:eastAsia="Arial" w:hAnsi="Arial"/>
+          <w:color w:val="222222"/>
+          <w:sz w:val="21"/>
+        </w:rPr>
+      </w:r>
+      <w:r>
+        <w:rPr>
+          <w:rFonts w:ascii="Arial" w:eastAsia="Arial" w:hAnsi="Arial"/>
+          <w:color w:val="222222"/>
+          <w:sz w:val="21"/>
+          <w:lang w:val="ru-RU"/>
+        </w:rPr>
+      </w:r>
+      <w:r>
+        <w:rPr>
+          <w:rFonts w:ascii="Arial" w:eastAsia="Arial" w:hAnsi="Arial"/>
+          <w:color w:val="222222"/>
+          <w:sz w:val="21"/>
+        </w:rPr>
+      </w:r>
+      <w:r>
+        <w:rPr>
+          <w:rFonts w:ascii="Arial" w:eastAsia="Arial" w:hAnsi="Arial"/>
+          <w:color w:val="222222"/>
+          <w:sz w:val="21"/>
+          <w:lang w:val="ru-RU"/>
+        </w:rPr>
+      </w:r>
+      <w:r>
+        <w:rPr>
+          <w:rFonts w:ascii="Arial" w:eastAsia="Arial" w:hAnsi="Arial"/>
+          <w:color w:val="222222"/>
+          <w:sz w:val="21"/>
+        </w:rPr>
+      </w:r>
+      <w:r>
+        <w:rPr>
+          <w:rFonts w:ascii="Arial" w:eastAsia="Arial" w:hAnsi="Arial"/>
+          <w:color w:val="222222"/>
+          <w:sz w:val="21"/>
+          <w:lang w:val="ru-RU"/>
+        </w:rPr>
+      </w:r>
+      <w:r>
+        <w:rPr>
+          <w:rFonts w:ascii="Arial" w:eastAsia="Arial" w:hAnsi="Arial"/>
+          <w:color w:val="222222"/>
+          <w:sz w:val="21"/>
+        </w:rPr>
+      </w:r>
+      <w:r>
+        <w:rPr>
+          <w:rFonts w:ascii="Arial" w:eastAsia="Arial" w:hAnsi="Arial"/>
+          <w:color w:val="222222"/>
+          <w:sz w:val="21"/>
+          <w:lang w:val="ru-RU"/>
+        </w:rPr>
+      </w:r>
+      <w:r>
+        <w:rPr>
+          <w:rFonts w:ascii="Arial" w:eastAsia="Arial" w:hAnsi="Arial"/>
+          <w:color w:val="222222"/>
+          <w:sz w:val="21"/>
+        </w:rPr>
+      </w:r>
+      <w:r>
+        <w:rPr>
+          <w:rFonts w:ascii="Arial" w:eastAsia="Arial" w:hAnsi="Arial"/>
+          <w:color w:val="222222"/>
+          <w:sz w:val="21"/>
+          <w:lang w:val="ru-RU"/>
+        </w:rPr>
+      </w:r>
+      <w:r>
+        <w:rPr>
+          <w:rFonts w:ascii="Arial" w:eastAsia="Arial" w:hAnsi="Arial"/>
+          <w:color w:val="222222"/>
+          <w:sz w:val="21"/>
+        </w:rPr>
+      </w:r>
+      <w:r>
+        <w:rPr>
+          <w:rFonts w:ascii="Arial" w:eastAsia="Arial" w:hAnsi="Arial"/>
+          <w:color w:val="222222"/>
+          <w:sz w:val="21"/>
+          <w:lang w:val="ru-RU"/>
+        </w:rPr>
+      </w:r>
+      <w:r>
+        <w:rPr>
+          <w:rFonts w:ascii="Arial" w:eastAsia="Arial" w:hAnsi="Arial"/>
+          <w:color w:val="222222"/>
+          <w:sz w:val="21"/>
+        </w:rPr>
+      </w:r>
+      <w:r>
+        <w:rPr>
+          <w:rFonts w:ascii="Arial" w:eastAsia="Arial" w:hAnsi="Arial"/>
+          <w:color w:val="222222"/>
+          <w:sz w:val="21"/>
+          <w:lang w:val="ru-RU"/>
+        </w:rPr>
+      </w:r>
+      <w:r>
+        <w:rPr>
+          <w:rFonts w:ascii="Arial" w:eastAsia="Arial" w:hAnsi="Arial"/>
+          <w:color w:val="222222"/>
+          <w:sz w:val="21"/>
+        </w:rPr>
+      </w:r>
+      <w:r>
+        <w:rPr>
+          <w:rFonts w:ascii="Arial" w:eastAsia="Arial" w:hAnsi="Arial"/>
+          <w:color w:val="222222"/>
+          <w:sz w:val="21"/>
+          <w:lang w:val="ru-RU"/>
+        </w:rPr>
+      </w:r>
+      <w:r>
+        <w:rPr>
+          <w:rFonts w:ascii="Arial" w:eastAsia="Arial" w:hAnsi="Arial"/>
+          <w:color w:val="222222"/>
+          <w:sz w:val="21"/>
+        </w:rPr>
+      </w:r>
+      <w:r>
+        <w:rPr>
+          <w:rFonts w:ascii="Arial" w:eastAsia="Arial" w:hAnsi="Arial"/>
+          <w:color w:val="222222"/>
+          <w:sz w:val="21"/>
+          <w:lang w:val="ru-RU"/>
+        </w:rPr>
+      </w:r>
+      <w:r>
+        <w:rPr>
+          <w:rFonts w:ascii="Arial" w:eastAsia="Arial" w:hAnsi="Arial"/>
+          <w:color w:val="222222"/>
+          <w:sz w:val="21"/>
+        </w:rPr>
+      </w:r>
+      <w:r>
+        <w:rPr>
+          <w:rFonts w:ascii="Arial" w:eastAsia="Arial" w:hAnsi="Arial"/>
+          <w:color w:val="222222"/>
+          <w:sz w:val="21"/>
+          <w:lang w:val="ru-RU"/>
+        </w:rPr>
       </w:r>
     </w:p>
     <w:p>

</xml_diff>

<commit_message>
Restructure markets resume: prop-desk first, then BI/DWH
Co-authored-by: dimonix2019 <dimonix2019@users.noreply.github.com>
</commit_message>
<xml_diff>
--- a/Abramov_DN_resume_PO_markets.docx
+++ b/Abramov_DN_resume_PO_markets.docx
@@ -381,6 +381,62 @@
       </w:r>
     </w:p>
     <w:p>
+      <w:r>
+        <w:t>Проекты</w:t>
+      </w:r>
+    </w:p>
+    <w:p>
+      <w:r>
+        <w:t>2024 — настоящее время</w:t>
+      </w:r>
+    </w:p>
+    <w:p>
+      <w:r>
+        <w:t>MoexMvp / strategy-web — веб-дашборд парного арбитража акций MOEX (TATN vs TATNP)</w:t>
+      </w:r>
+    </w:p>
+    <w:p>
+      <w:r>
+        <w:t>Роль: sole / primary builder — дизайн desk, стратегия, live engine, testing UX, parity tooling, брокерский контур.</w:t>
+      </w:r>
+    </w:p>
+    <w:p>
+      <w:r>
+        <w:t>• «Торговля» (Prod trade desk): live Z-score / спред, чеклист условий входа-выхода, AUTO-монитор, параметры (пороги Z, плечо, депозит, ТП), открытая позиция, прогноз PnL после закрытия (комиссии, overnight, bid/ask), история сделок; paper/prod execution path (Tinkoff Invest API).</w:t>
+      </w:r>
+    </w:p>
+    <w:p>
+      <w:r>
+        <w:t>• «Тестирование»: bar-replay / симуляция на истории; heatmap порогов Z; equity/PnL и таблица сделок; Cap ON/OFF, slip, TP 1/2/3%; режимы M15 close vs «касание 1м» (tip-Z).</w:t>
+      </w:r>
+    </w:p>
+    <w:p>
+      <w:r>
+        <w:t>• Паритет Test↔Prod: сверка сигналов/сделок, hourly digests, decision_bars (заморозка OHLC/Z в момент решения) — backtest без «рисования» входов задним числом.</w:t>
+      </w:r>
+    </w:p>
+    <w:p>
+      <w:r>
+        <w:t>• Стратегия: mean-reversion по Z-score спреда TATN−TATNP (rolling μ/σ ~30д); вход/выход ±entry / ±exit (prod по умолчанию ±1.6 / ±1.3); эволюция closed M15 + settle → tip1m «касание порога»; учёт slip, комиссии ~0.04%/сторона, overnight ~0.033%/день; аналитика бимодального спреда (узкий / широкий / переход) в UI.</w:t>
+      </w:r>
+    </w:p>
+    <w:p>
+      <w:r>
+        <w:t>• Инженерия и observability: ISS market data (M15 из 10м + 1м tip), SQLite (replay + live_trading.db), health и checklist gating (session/broker/edge), Android WebView companion + rolling debug APK.</w:t>
+      </w:r>
+    </w:p>
+    <w:p>
+      <w:r>
+        <w:t>• Стек: Python (FastAPI/uvicorn) live engine + Windows-служба watchdog; vanilla JS + Lightweight Charts (не React); Tinkoff Invest API (sandbox/prod).</w:t>
+      </w:r>
+    </w:p>
+    <w:p>
+      <w:r>
+        <w:t>One-liner: Built a full-stack MOEX pairs-trading desk (Python live engine + JS research/trading UI): Z-score mean-reversion on TATN/TATNP, 1m tip execution, backtest heatmap, Test↔Prod parity, and Tinkoff broker integration.</w:t>
+      </w:r>
+    </w:p>
+    <w:p/>
+    <w:p>
       <w:pPr>
         <w:pBdr>
           <w:bottom w:val="single" w:sz="12" w:space="4" w:color="CCCCCC"/>
@@ -402,6 +458,11 @@
       </w:r>
     </w:p>
     <w:p>
+      <w:r>
+        <w:t>Корпоративный опыт — BI и управленческая отчётность, DWH (контуры, витрины, архитектура, ИБ), CI/CD и промышленная поставка для заказчика.</w:t>
+      </w:r>
+    </w:p>
+    <w:p>
       <w:pPr>
         <w:spacing w:before="200" w:after="20"/>
         <w:rPr>
@@ -3235,62 +3296,6 @@
         <w:t>; поддержка доменной и почтовой инфраструктуры.</w:t>
       </w:r>
     </w:p>
-    <w:p>
-      <w:r>
-        <w:t>Проекты</w:t>
-      </w:r>
-    </w:p>
-    <w:p>
-      <w:r>
-        <w:t>2024 — настоящее время</w:t>
-      </w:r>
-    </w:p>
-    <w:p>
-      <w:r>
-        <w:t>MoexMvp / strategy-web — веб-дашборд парного арбитража акций MOEX (TATN vs TATNP)</w:t>
-      </w:r>
-    </w:p>
-    <w:p>
-      <w:r>
-        <w:t>Sole / primary builder: дизайн desk, стратегия, live engine, testing UX, parity tooling, брокерский контур.</w:t>
-      </w:r>
-    </w:p>
-    <w:p>
-      <w:r>
-        <w:t>• «Торговля» (Prod trade desk): live Z-score / спред, чеклист условий входа-выхода, AUTO-монитор, параметры (пороги Z, плечо, депозит, ТП), открытая позиция, прогноз PnL после закрытия (комиссии, overnight, bid/ask), история сделок; paper/prod execution path (Tinkoff Invest API).</w:t>
-      </w:r>
-    </w:p>
-    <w:p>
-      <w:r>
-        <w:t>• «Тестирование»: bar-replay / симуляция на истории; heatmap порогов Z; equity/PnL и таблица сделок; Cap ON/OFF, slip, TP 1/2/3%; режимы M15 close vs «касание 1м» (tip-Z).</w:t>
-      </w:r>
-    </w:p>
-    <w:p>
-      <w:r>
-        <w:t>• Паритет Test↔Prod: сверка сигналов/сделок, hourly digests, decision_bars (заморозка OHLC/Z в момент решения) — backtest без «рисования» входов задним числом.</w:t>
-      </w:r>
-    </w:p>
-    <w:p>
-      <w:r>
-        <w:t>• Стратегия: mean-reversion по Z-score спреда TATN−TATNP (rolling μ/σ ~30д); вход/выход ±entry / ±exit (prod по умолчанию ±1.6 / ±1.3); эволюция closed M15 + settle → tip1m «касание порога»; учёт slip, комиссии ~0.04%/сторона, overnight ~0.033%/день; аналитика бимодального спреда (узкий / широкий / переход) в UI.</w:t>
-      </w:r>
-    </w:p>
-    <w:p>
-      <w:r>
-        <w:t>• Инженерия и observability: ISS market data (M15 из 10м + 1м tip), SQLite (replay + live_trading.db), health и checklist gating (session/broker/edge), Android WebView companion + rolling debug APK.</w:t>
-      </w:r>
-    </w:p>
-    <w:p>
-      <w:r>
-        <w:t>• Стек: Python (FastAPI/uvicorn) live engine + Windows-служба watchdog; vanilla JS + Lightweight Charts (не React); Tinkoff Invest API (sandbox/prod).</w:t>
-      </w:r>
-    </w:p>
-    <w:p>
-      <w:r>
-        <w:t>One-liner: Built a full-stack MOEX pairs-trading desk (Python live engine + JS research/trading UI): Z-score mean-reversion on TATN/TATNP, 1m tip execution, backtest heatmap, Test↔Prod parity, and Tinkoff broker integration.</w:t>
-      </w:r>
-    </w:p>
-    <w:p/>
     <w:p>
       <w:pPr>
         <w:pBdr>
@@ -4929,7 +4934,7 @@
           <w:sz w:val="21"/>
           <w:lang w:val="ru-RU"/>
         </w:rPr>
-        <w:t>Менеджер продукта аналитических и торговых систем на фондовом рынке. Sole / primary builder prop-desk парного арбитража MOEX (TATN vs TATNP): гипотеза и метрики стратегии → research/trading UI → live-контур исполнения → паритет backtest↔prod и обратная связь по сделкам. Опыт корпоративной аналитики (управленческая отчётность, BI, мониторинг процессов) и платформенных данных (DWH) переношу в продукт торгового стола: понятный desk, проверяемые решения, observability.</w:t>
+        <w:t>Менеджер продукта аналитических и торговых систем / prop-desk на фондовом рынке. Строю торговый desk парного арбитража MOEX (TATN vs TATNP): стратегия и метрики → research/trading UI → live-исполнение → паритет backtest↔prod. Корпоративный опыт усиливает продукт: умею строить BI и управленческую отчётность для заказчика, понимаю устройство DWH (контуры, витрины, архитектура, ИБ), CI/CD и поставку изменений в промышленный контур. Сильный бэкграунд разработки ПО (C#, SQL, Python/FastAPI, JS, Android companion) — могу говорить с инженерами на одном языке и доводить продукт до рабочего экрана.</w:t>
       </w:r>
       <w:r>
         <w:rPr>
@@ -5111,8 +5116,7 @@
           <w:sz w:val="21"/>
           <w:lang w:val="ru-RU"/>
         </w:rPr>
-        <w:lastRenderedPageBreak/>
-        <w:t>Коммуникабельный, ответственный, самостоятельный. Быстро обучаюсь, постоянно повышаю профессиональный уровень. Умение работать с людьми и доводить продукт до видимого результата для пользователей.</w:t>
+        <w:t>Самостоятельно веду продукт от гипотезы до поставки; работаю с командой и стейкхолдерами; фокус на понятном desk, проверяемых решениях и видимом результате.</w:t>
       </w:r>
     </w:p>
     <w:sectPr>

</xml_diff>

<commit_message>
Put MoexMvp Projects block at top of markets resume
Co-authored-by: dimonix2019 <dimonix2019@users.noreply.github.com>
</commit_message>
<xml_diff>
--- a/Abramov_DN_resume_PO_markets.docx
+++ b/Abramov_DN_resume_PO_markets.docx
@@ -253,189 +253,206 @@
         </w:rPr>
       </w:r>
     </w:p>
+    <w:p/>
     <w:p>
-      <w:pPr>
-        <w:spacing w:after="0" w:line="252" w:lineRule="auto"/>
-        <w:rPr>
-          <w:lang w:val="ru-RU"/>
-        </w:rPr>
-      </w:pPr>
-      <w:r>
-        <w:rPr>
-          <w:rFonts w:ascii="Arial" w:eastAsia="Arial" w:hAnsi="Arial"/>
-          <w:color w:val="222222"/>
-          <w:sz w:val="20"/>
-          <w:lang w:val="ru-RU"/>
-        </w:rPr>
-        <w:t>Специализации:</w:t>
+      <w:r>
+        <w:t>Проекты</w:t>
       </w:r>
     </w:p>
     <w:p>
-      <w:pPr>
-        <w:spacing w:after="0" w:line="252" w:lineRule="auto"/>
-        <w:rPr>
-          <w:lang w:val="ru-RU"/>
-        </w:rPr>
-      </w:pPr>
-      <w:r>
-        <w:rPr>
-          <w:rFonts w:ascii="Arial" w:eastAsia="Arial" w:hAnsi="Arial"/>
-          <w:color w:val="222222"/>
-          <w:sz w:val="20"/>
-          <w:lang w:val="ru-RU"/>
-        </w:rPr>
-        <w:t xml:space="preserve">—  Менеджер продукта / </w:t>
-      </w:r>
-      <w:r>
-        <w:rPr>
-          <w:rFonts w:ascii="Arial" w:eastAsia="Arial" w:hAnsi="Arial"/>
-          <w:color w:val="222222"/>
-          <w:sz w:val="20"/>
-        </w:rPr>
-        <w:t>Product</w:t>
-      </w:r>
-      <w:r>
-        <w:rPr>
-          <w:rFonts w:ascii="Arial" w:eastAsia="Arial" w:hAnsi="Arial"/>
-          <w:color w:val="222222"/>
-          <w:sz w:val="20"/>
-          <w:lang w:val="ru-RU"/>
-        </w:rPr>
-        <w:t xml:space="preserve"> </w:t>
-      </w:r>
-      <w:r>
-        <w:rPr>
-          <w:rFonts w:ascii="Arial" w:eastAsia="Arial" w:hAnsi="Arial"/>
-          <w:color w:val="222222"/>
-          <w:sz w:val="20"/>
-        </w:rPr>
-        <w:t>Owner</w:t>
+      <w:r>
+        <w:t>2024 — настоящее время</w:t>
       </w:r>
     </w:p>
     <w:p>
-      <w:pPr>
-        <w:spacing w:after="0" w:line="252" w:lineRule="auto"/>
-        <w:rPr>
-          <w:lang w:val="ru-RU"/>
-        </w:rPr>
-      </w:pPr>
-      <w:r>
-        <w:rPr>
-          <w:rFonts w:ascii="Arial" w:eastAsia="Arial" w:hAnsi="Arial"/>
-          <w:color w:val="222222"/>
-          <w:sz w:val="20"/>
-          <w:lang w:val="ru-RU"/>
-        </w:rPr>
-        <w:t>Тип занятости: полная занятость</w:t>
+      <w:r>
+        <w:t>MoexMvp / strategy-web — веб-дашборд парного арбитража акций MOEX (TATN vs TATNP)</w:t>
       </w:r>
     </w:p>
     <w:p>
-      <w:pPr>
-        <w:spacing w:after="0" w:line="252" w:lineRule="auto"/>
-        <w:rPr>
-          <w:lang w:val="ru-RU"/>
-        </w:rPr>
-      </w:pPr>
-      <w:r>
-        <w:rPr>
-          <w:rFonts w:ascii="Arial" w:eastAsia="Arial" w:hAnsi="Arial"/>
-          <w:color w:val="222222"/>
-          <w:sz w:val="20"/>
-          <w:lang w:val="ru-RU"/>
-        </w:rPr>
-        <w:t>Формат работы: на месте работодателя, удалённо, гибрид</w:t>
+      <w:r>
+        <w:t>Sole / primary builder: дизайн desk, стратегия, live engine, testing UX, parity tooling, брокерский контур.</w:t>
       </w:r>
     </w:p>
     <w:p>
-      <w:pPr>
-        <w:spacing w:after="40" w:line="252" w:lineRule="auto"/>
-        <w:rPr>
-          <w:lang w:val="ru-RU"/>
-        </w:rPr>
-      </w:pPr>
-      <w:r>
-        <w:rPr>
-          <w:rFonts w:ascii="Arial" w:eastAsia="Arial" w:hAnsi="Arial"/>
-          <w:color w:val="222222"/>
-          <w:sz w:val="20"/>
-          <w:lang w:val="ru-RU"/>
-        </w:rPr>
-        <w:t>Желательное время в пути до работы: не имеет значения</w:t>
+      <w:r>
+        <w:t>• «Торговля» (Prod trade desk): live Z-score / спред, чеклист условий входа-выхода, AUTO-монитор, параметры (пороги Z, плечо, депозит, ТП), открытая позиция, прогноз PnL после закрытия (комиссии, overnight, bid/ask), история сделок; paper/prod execution path (Tinkoff Invest API).</w:t>
       </w:r>
     </w:p>
     <w:p>
-      <w:pPr>
-        <w:spacing w:after="120" w:line="252" w:lineRule="auto"/>
-        <w:rPr>
-          <w:lang w:val="ru-RU"/>
-        </w:rPr>
-      </w:pPr>
-      <w:r>
-        <w:rPr>
-          <w:rFonts w:ascii="Arial" w:eastAsia="Arial" w:hAnsi="Arial"/>
-          <w:b/>
-          <w:color w:val="222222"/>
-          <w:lang w:val="ru-RU"/>
-        </w:rPr>
-        <w:t>400 000 ₽ на руки</w:t>
+      <w:r>
+        <w:t>• «Тестирование»: bar-replay / симуляция на истории; heatmap порогов Z; equity/PnL и таблица сделок; Cap ON/OFF, slip, TP 1/2/3%; режимы M15 close vs «касание 1м» (tip-Z).</w:t>
       </w:r>
     </w:p>
     <w:p>
       <w:r>
-        <w:t>Проекты</w:t>
+        <w:t>• Паритет Test↔Prod: сверка сигналов/сделок, hourly digests, decision_bars (заморозка OHLC/Z в момент решения) — backtest без «рисования» входов задним числом.</w:t>
       </w:r>
     </w:p>
     <w:p>
       <w:r>
-        <w:t>2024 — настоящее время</w:t>
+        <w:t>• Стратегия: mean-reversion по Z-score спреда TATN−TATNP (rolling μ/σ ~30д); вход/выход ±entry / ±exit (prod по умолчанию ±1.6 / ±1.3); эволюция closed M15 + settle → tip1m «касание порога»; учёт slip, комиссии ~0.04%/сторона, overnight ~0.033%/день; аналитика бимодального спреда (узкий / широкий / переход) в UI.</w:t>
       </w:r>
     </w:p>
     <w:p>
       <w:r>
-        <w:t>MoexMvp / strategy-web — веб-дашборд парного арбитража акций MOEX (TATN vs TATNP)</w:t>
+        <w:t>• Инженерия и observability: ISS market data (M15 из 10м + 1м tip), SQLite (replay + live_trading.db), health и checklist gating (session/broker/edge), Android WebView companion + rolling debug APK.</w:t>
       </w:r>
     </w:p>
     <w:p>
       <w:r>
-        <w:t>Роль: sole / primary builder — дизайн desk, стратегия, live engine, testing UX, parity tooling, брокерский контур.</w:t>
+        <w:t>• Стек: Python (FastAPI/uvicorn) live engine + Windows-служба watchdog; vanilla JS + Lightweight Charts (не React); Tinkoff Invest API (sandbox/prod).</w:t>
       </w:r>
     </w:p>
     <w:p>
       <w:r>
-        <w:t>• «Торговля» (Prod trade desk): live Z-score / спред, чеклист условий входа-выхода, AUTO-монитор, параметры (пороги Z, плечо, депозит, ТП), открытая позиция, прогноз PnL после закрытия (комиссии, overnight, bid/ask), история сделок; paper/prod execution path (Tinkoff Invest API).</w:t>
+        <w:t>One-liner: Built a full-stack MOEX pairs-trading desk (Python live engine + JS research/trading UI): Z-score mean-reversion on TATN/TATNP, 1m tip execution, backtest heatmap, Test↔Prod parity, and Tinkoff broker integration.</w:t>
+      </w:r>
+    </w:p>
+    <w:p/>
+    <w:p>
+      <w:r>
+        <w:t>Обо мне</w:t>
       </w:r>
     </w:p>
     <w:p>
       <w:r>
-        <w:t>• «Тестирование»: bar-replay / симуляция на истории; heatmap порогов Z; equity/PnL и таблица сделок; Cap ON/OFF, slip, TP 1/2/3%; режимы M15 close vs «касание 1м» (tip-Z).</w:t>
+        <w:t>Менеджер продукта аналитических и торговых систем / prop-desk на фондовом рынке. Строю торговый desk парного арбитража MOEX (TATN vs TATNP): стратегия и метрики → research/trading UI → live-исполнение → паритет backtest↔prod. Корпоративный опыт усиливает продукт: умею строить BI и управленческую отчётность для заказчика, понимаю устройство DWH (контуры, витрины, архитектура, ИБ), CI/CD и поставку изменений в промышленный контур. Сильный бэкграунд разработки ПО (C#, SQL, Python/FastAPI, JS, Android companion) — могу говорить с инженерами на одном языке и доводить продукт до рабочего экрана.</w:t>
       </w:r>
     </w:p>
     <w:p>
       <w:r>
-        <w:t>• Паритет Test↔Prod: сверка сигналов/сделок, hourly digests, decision_bars (заморозка OHLC/Z в момент решения) — backtest без «рисования» входов задним числом.</w:t>
+        <w:t>Самостоятельно веду продукт от гипотезы до поставки; работаю с командой и стейкхолдерами; фокус на понятном desk, проверяемых решениях и видимом результате.</w:t>
+      </w:r>
+    </w:p>
+    <w:p/>
+    <w:p>
+      <w:pPr>
+        <w:spacing w:after="0" w:line="252" w:lineRule="auto"/>
+        <w:rPr>
+          <w:lang w:val="ru-RU"/>
+        </w:rPr>
+      </w:pPr>
+      <w:r>
+        <w:rPr>
+          <w:rFonts w:ascii="Arial" w:eastAsia="Arial" w:hAnsi="Arial"/>
+          <w:color w:val="222222"/>
+          <w:sz w:val="20"/>
+          <w:lang w:val="ru-RU"/>
+        </w:rPr>
+        <w:t>Специализации:</w:t>
       </w:r>
     </w:p>
     <w:p>
-      <w:r>
-        <w:t>• Стратегия: mean-reversion по Z-score спреда TATN−TATNP (rolling μ/σ ~30д); вход/выход ±entry / ±exit (prod по умолчанию ±1.6 / ±1.3); эволюция closed M15 + settle → tip1m «касание порога»; учёт slip, комиссии ~0.04%/сторона, overnight ~0.033%/день; аналитика бимодального спреда (узкий / широкий / переход) в UI.</w:t>
+      <w:pPr>
+        <w:spacing w:after="0" w:line="252" w:lineRule="auto"/>
+        <w:rPr>
+          <w:lang w:val="ru-RU"/>
+        </w:rPr>
+      </w:pPr>
+      <w:r>
+        <w:rPr>
+          <w:rFonts w:ascii="Arial" w:eastAsia="Arial" w:hAnsi="Arial"/>
+          <w:color w:val="222222"/>
+          <w:sz w:val="20"/>
+          <w:lang w:val="ru-RU"/>
+        </w:rPr>
+        <w:t xml:space="preserve">—  Менеджер продукта / </w:t>
+      </w:r>
+      <w:r>
+        <w:rPr>
+          <w:rFonts w:ascii="Arial" w:eastAsia="Arial" w:hAnsi="Arial"/>
+          <w:color w:val="222222"/>
+          <w:sz w:val="20"/>
+        </w:rPr>
+        <w:t>Product</w:t>
+      </w:r>
+      <w:r>
+        <w:rPr>
+          <w:rFonts w:ascii="Arial" w:eastAsia="Arial" w:hAnsi="Arial"/>
+          <w:color w:val="222222"/>
+          <w:sz w:val="20"/>
+          <w:lang w:val="ru-RU"/>
+        </w:rPr>
+        <w:t xml:space="preserve"> </w:t>
+      </w:r>
+      <w:r>
+        <w:rPr>
+          <w:rFonts w:ascii="Arial" w:eastAsia="Arial" w:hAnsi="Arial"/>
+          <w:color w:val="222222"/>
+          <w:sz w:val="20"/>
+        </w:rPr>
+        <w:t>Owner</w:t>
       </w:r>
     </w:p>
     <w:p>
-      <w:r>
-        <w:t>• Инженерия и observability: ISS market data (M15 из 10м + 1м tip), SQLite (replay + live_trading.db), health и checklist gating (session/broker/edge), Android WebView companion + rolling debug APK.</w:t>
+      <w:pPr>
+        <w:spacing w:after="0" w:line="252" w:lineRule="auto"/>
+        <w:rPr>
+          <w:lang w:val="ru-RU"/>
+        </w:rPr>
+      </w:pPr>
+      <w:r>
+        <w:rPr>
+          <w:rFonts w:ascii="Arial" w:eastAsia="Arial" w:hAnsi="Arial"/>
+          <w:color w:val="222222"/>
+          <w:sz w:val="20"/>
+          <w:lang w:val="ru-RU"/>
+        </w:rPr>
+        <w:t>Тип занятости: полная занятость</w:t>
       </w:r>
     </w:p>
     <w:p>
-      <w:r>
-        <w:t>• Стек: Python (FastAPI/uvicorn) live engine + Windows-служба watchdog; vanilla JS + Lightweight Charts (не React); Tinkoff Invest API (sandbox/prod).</w:t>
+      <w:pPr>
+        <w:spacing w:after="0" w:line="252" w:lineRule="auto"/>
+        <w:rPr>
+          <w:lang w:val="ru-RU"/>
+        </w:rPr>
+      </w:pPr>
+      <w:r>
+        <w:rPr>
+          <w:rFonts w:ascii="Arial" w:eastAsia="Arial" w:hAnsi="Arial"/>
+          <w:color w:val="222222"/>
+          <w:sz w:val="20"/>
+          <w:lang w:val="ru-RU"/>
+        </w:rPr>
+        <w:t>Формат работы: на месте работодателя, удалённо, гибрид</w:t>
       </w:r>
     </w:p>
     <w:p>
-      <w:r>
-        <w:t>One-liner: Built a full-stack MOEX pairs-trading desk (Python live engine + JS research/trading UI): Z-score mean-reversion on TATN/TATNP, 1m tip execution, backtest heatmap, Test↔Prod parity, and Tinkoff broker integration.</w:t>
+      <w:pPr>
+        <w:spacing w:after="40" w:line="252" w:lineRule="auto"/>
+        <w:rPr>
+          <w:lang w:val="ru-RU"/>
+        </w:rPr>
+      </w:pPr>
+      <w:r>
+        <w:rPr>
+          <w:rFonts w:ascii="Arial" w:eastAsia="Arial" w:hAnsi="Arial"/>
+          <w:color w:val="222222"/>
+          <w:sz w:val="20"/>
+          <w:lang w:val="ru-RU"/>
+        </w:rPr>
+        <w:t>Желательное время в пути до работы: не имеет значения</w:t>
       </w:r>
     </w:p>
-    <w:p/>
+    <w:p>
+      <w:pPr>
+        <w:spacing w:after="120" w:line="252" w:lineRule="auto"/>
+        <w:rPr>
+          <w:lang w:val="ru-RU"/>
+        </w:rPr>
+      </w:pPr>
+      <w:r>
+        <w:rPr>
+          <w:rFonts w:ascii="Arial" w:eastAsia="Arial" w:hAnsi="Arial"/>
+          <w:b/>
+          <w:color w:val="222222"/>
+          <w:lang w:val="ru-RU"/>
+        </w:rPr>
+        <w:t>400 000 ₽ на руки</w:t>
+      </w:r>
+    </w:p>
     <w:p>
       <w:pPr>
         <w:pBdr>
@@ -4527,7 +4544,7 @@
           <w:color w:val="222222"/>
           <w:sz w:val="20"/>
         </w:rPr>
-        <w:t>Product ownership  ·  Prop-desk / trading desk  ·  Парный арбитраж (MOEX)  ·  Z-score / mean-reversion  ·  Live trading monitor  ·  Backtest &amp; Test↔Prod parity  ·  Market data (MOEX ISS)  ·  Research UI (replay, heatmap, equity)  ·  Tinkoff Invest API  ·  Python / FastAPI  ·  Lightweight Charts  ·  BI / дашборды  ·  QlikView / QlikSense  ·  Мониторинг процессов  ·  Discovery → метрики → UI → обратная связь  ·  Roadmap / бэклог  ·  DWH / витрины данных  ·  SQL  ·  Agile / Scrum</w:t>
+        <w:t>Product ownership  ·  Prop-desk / trading desk  ·  Парный арбитраж (MOEX)  ·  Z-score / mean-reversion  ·  Live trading monitor  ·  Backtest &amp; Test↔Prod parity  ·  Market data (MOEX ISS)  ·  Research UI (replay, heatmap, equity)  ·  Tinkoff Invest API  ·  Python / FastAPI  ·  Lightweight Charts  ·  Разработка ПО  ·  BI / дашборды  ·  QlikView / QlikSense  ·  DWH / витрины данных  ·  CI/CD  ·  Discovery → метрики → UI → обратная связь  ·  Roadmap / бэклог  ·  SQL  ·  Agile / Scrum</w:t>
       </w:r>
       <w:r>
         <w:rPr>
@@ -4879,244 +4896,6 @@
           <w:sz w:val="20"/>
         </w:rPr>
         <w:t>C</w:t>
-      </w:r>
-    </w:p>
-    <w:p>
-      <w:pPr>
-        <w:pBdr>
-          <w:bottom w:val="single" w:sz="12" w:space="4" w:color="CCCCCC"/>
-        </w:pBdr>
-        <w:spacing w:before="240" w:after="120"/>
-        <w:rPr>
-          <w:lang w:val="ru-RU"/>
-        </w:rPr>
-      </w:pPr>
-      <w:r>
-        <w:rPr>
-          <w:rFonts w:ascii="Arial" w:eastAsia="Arial" w:hAnsi="Arial"/>
-          <w:b/>
-          <w:color w:val="222222"/>
-          <w:sz w:val="26"/>
-          <w:lang w:val="ru-RU"/>
-        </w:rPr>
-        <w:t>Дополнительная информация</w:t>
-      </w:r>
-    </w:p>
-    <w:p>
-      <w:pPr>
-        <w:spacing w:after="40" w:line="252" w:lineRule="auto"/>
-        <w:rPr>
-          <w:lang w:val="ru-RU"/>
-        </w:rPr>
-      </w:pPr>
-      <w:r>
-        <w:rPr>
-          <w:rFonts w:ascii="Arial" w:eastAsia="Arial" w:hAnsi="Arial"/>
-          <w:b/>
-          <w:color w:val="222222"/>
-          <w:sz w:val="20"/>
-          <w:lang w:val="ru-RU"/>
-        </w:rPr>
-        <w:t>Обо мне</w:t>
-      </w:r>
-    </w:p>
-    <w:p>
-      <w:pPr>
-        <w:spacing w:after="80" w:line="252" w:lineRule="auto"/>
-        <w:rPr>
-          <w:lang w:val="ru-RU"/>
-        </w:rPr>
-      </w:pPr>
-      <w:r>
-        <w:rPr>
-          <w:rFonts w:ascii="Arial" w:eastAsia="Arial" w:hAnsi="Arial"/>
-          <w:color w:val="222222"/>
-          <w:sz w:val="21"/>
-          <w:lang w:val="ru-RU"/>
-        </w:rPr>
-        <w:t>Менеджер продукта аналитических и торговых систем / prop-desk на фондовом рынке. Строю торговый desk парного арбитража MOEX (TATN vs TATNP): стратегия и метрики → research/trading UI → live-исполнение → паритет backtest↔prod. Корпоративный опыт усиливает продукт: умею строить BI и управленческую отчётность для заказчика, понимаю устройство DWH (контуры, витрины, архитектура, ИБ), CI/CD и поставку изменений в промышленный контур. Сильный бэкграунд разработки ПО (C#, SQL, Python/FastAPI, JS, Android companion) — могу говорить с инженерами на одном языке и доводить продукт до рабочего экрана.</w:t>
-      </w:r>
-      <w:r>
-        <w:rPr>
-          <w:rFonts w:ascii="Arial" w:eastAsia="Arial" w:hAnsi="Arial"/>
-          <w:color w:val="222222"/>
-          <w:sz w:val="21"/>
-        </w:rPr>
-      </w:r>
-      <w:r>
-        <w:rPr>
-          <w:rFonts w:ascii="Arial" w:eastAsia="Arial" w:hAnsi="Arial"/>
-          <w:color w:val="222222"/>
-          <w:sz w:val="21"/>
-          <w:lang w:val="ru-RU"/>
-        </w:rPr>
-      </w:r>
-      <w:r>
-        <w:rPr>
-          <w:rFonts w:ascii="Arial" w:eastAsia="Arial" w:hAnsi="Arial"/>
-          <w:color w:val="222222"/>
-          <w:sz w:val="21"/>
-        </w:rPr>
-      </w:r>
-      <w:r>
-        <w:rPr>
-          <w:rFonts w:ascii="Arial" w:eastAsia="Arial" w:hAnsi="Arial"/>
-          <w:color w:val="222222"/>
-          <w:sz w:val="21"/>
-          <w:lang w:val="ru-RU"/>
-        </w:rPr>
-      </w:r>
-      <w:r>
-        <w:rPr>
-          <w:rFonts w:ascii="Arial" w:eastAsia="Arial" w:hAnsi="Arial"/>
-          <w:color w:val="222222"/>
-          <w:sz w:val="21"/>
-        </w:rPr>
-      </w:r>
-      <w:r>
-        <w:rPr>
-          <w:rFonts w:ascii="Arial" w:eastAsia="Arial" w:hAnsi="Arial"/>
-          <w:color w:val="222222"/>
-          <w:sz w:val="21"/>
-          <w:lang w:val="ru-RU"/>
-        </w:rPr>
-      </w:r>
-      <w:r>
-        <w:rPr>
-          <w:rFonts w:ascii="Arial" w:eastAsia="Arial" w:hAnsi="Arial"/>
-          <w:color w:val="222222"/>
-          <w:sz w:val="21"/>
-        </w:rPr>
-      </w:r>
-      <w:r>
-        <w:rPr>
-          <w:rFonts w:ascii="Arial" w:eastAsia="Arial" w:hAnsi="Arial"/>
-          <w:color w:val="222222"/>
-          <w:sz w:val="21"/>
-          <w:lang w:val="ru-RU"/>
-        </w:rPr>
-      </w:r>
-      <w:r>
-        <w:rPr>
-          <w:rFonts w:ascii="Arial" w:eastAsia="Arial" w:hAnsi="Arial"/>
-          <w:color w:val="222222"/>
-          <w:sz w:val="21"/>
-        </w:rPr>
-      </w:r>
-      <w:r>
-        <w:rPr>
-          <w:rFonts w:ascii="Arial" w:eastAsia="Arial" w:hAnsi="Arial"/>
-          <w:color w:val="222222"/>
-          <w:sz w:val="21"/>
-          <w:lang w:val="ru-RU"/>
-        </w:rPr>
-      </w:r>
-      <w:r>
-        <w:rPr>
-          <w:rFonts w:ascii="Arial" w:eastAsia="Arial" w:hAnsi="Arial"/>
-          <w:color w:val="222222"/>
-          <w:sz w:val="21"/>
-        </w:rPr>
-      </w:r>
-      <w:r>
-        <w:rPr>
-          <w:rFonts w:ascii="Arial" w:eastAsia="Arial" w:hAnsi="Arial"/>
-          <w:color w:val="222222"/>
-          <w:sz w:val="21"/>
-          <w:lang w:val="ru-RU"/>
-        </w:rPr>
-      </w:r>
-      <w:r>
-        <w:rPr>
-          <w:rFonts w:ascii="Arial" w:eastAsia="Arial" w:hAnsi="Arial"/>
-          <w:color w:val="222222"/>
-          <w:sz w:val="21"/>
-        </w:rPr>
-      </w:r>
-      <w:r>
-        <w:rPr>
-          <w:rFonts w:ascii="Arial" w:eastAsia="Arial" w:hAnsi="Arial"/>
-          <w:color w:val="222222"/>
-          <w:sz w:val="21"/>
-          <w:lang w:val="ru-RU"/>
-        </w:rPr>
-      </w:r>
-      <w:r>
-        <w:rPr>
-          <w:rFonts w:ascii="Arial" w:eastAsia="Arial" w:hAnsi="Arial"/>
-          <w:color w:val="222222"/>
-          <w:sz w:val="21"/>
-        </w:rPr>
-      </w:r>
-      <w:r>
-        <w:rPr>
-          <w:rFonts w:ascii="Arial" w:eastAsia="Arial" w:hAnsi="Arial"/>
-          <w:color w:val="222222"/>
-          <w:sz w:val="21"/>
-          <w:lang w:val="ru-RU"/>
-        </w:rPr>
-      </w:r>
-      <w:r>
-        <w:rPr>
-          <w:rFonts w:ascii="Arial" w:eastAsia="Arial" w:hAnsi="Arial"/>
-          <w:color w:val="222222"/>
-          <w:sz w:val="21"/>
-        </w:rPr>
-      </w:r>
-      <w:r>
-        <w:rPr>
-          <w:rFonts w:ascii="Arial" w:eastAsia="Arial" w:hAnsi="Arial"/>
-          <w:color w:val="222222"/>
-          <w:sz w:val="21"/>
-          <w:lang w:val="ru-RU"/>
-        </w:rPr>
-      </w:r>
-      <w:r>
-        <w:rPr>
-          <w:rFonts w:ascii="Arial" w:eastAsia="Arial" w:hAnsi="Arial"/>
-          <w:color w:val="222222"/>
-          <w:sz w:val="21"/>
-        </w:rPr>
-      </w:r>
-      <w:r>
-        <w:rPr>
-          <w:rFonts w:ascii="Arial" w:eastAsia="Arial" w:hAnsi="Arial"/>
-          <w:color w:val="222222"/>
-          <w:sz w:val="21"/>
-          <w:lang w:val="ru-RU"/>
-        </w:rPr>
-      </w:r>
-      <w:r>
-        <w:rPr>
-          <w:rFonts w:ascii="Arial" w:eastAsia="Arial" w:hAnsi="Arial"/>
-          <w:color w:val="222222"/>
-          <w:sz w:val="21"/>
-        </w:rPr>
-      </w:r>
-      <w:r>
-        <w:rPr>
-          <w:rFonts w:ascii="Arial" w:eastAsia="Arial" w:hAnsi="Arial"/>
-          <w:color w:val="222222"/>
-          <w:sz w:val="21"/>
-          <w:lang w:val="ru-RU"/>
-        </w:rPr>
-      </w:r>
-    </w:p>
-    <w:p>
-      <w:pPr>
-        <w:spacing w:after="160" w:line="252" w:lineRule="auto"/>
-        <w:rPr>
-          <w:lang w:val="ru-RU"/>
-        </w:rPr>
-      </w:pPr>
-      <w:r>
-        <w:rPr>
-          <w:rFonts w:ascii="Arial" w:eastAsia="Arial" w:hAnsi="Arial"/>
-          <w:color w:val="222222"/>
-          <w:sz w:val="21"/>
-          <w:lang w:val="ru-RU"/>
-        </w:rPr>
-        <w:t>Самостоятельно веду продукт от гипотезы до поставки; работаю с командой и стейкхолдерами; фокус на понятном desk, проверяемых решениях и видимом результате.</w:t>
       </w:r>
     </w:p>
     <w:sectPr>

</xml_diff>

<commit_message>
Make MoexMvp project block HR-friendly Russian
Co-authored-by: dimonix2019 <dimonix2019@users.noreply.github.com>
</commit_message>
<xml_diff>
--- a/Abramov_DN_resume_PO_markets.docx
+++ b/Abramov_DN_resume_PO_markets.docx
@@ -266,47 +266,47 @@
     </w:p>
     <w:p>
       <w:r>
-        <w:t>MoexMvp / strategy-web — веб-дашборд парного арбитража акций MOEX (TATN vs TATNP)</w:t>
+        <w:t>Личный продукт: торговый дашборд парного арбитража акций Московской биржи (ТАТНЕФТЬ обыкн. / привилегированные)</w:t>
       </w:r>
     </w:p>
     <w:p>
       <w:r>
-        <w:t>Sole / primary builder: дизайн desk, стратегия, live engine, testing UX, parity tooling, брокерский контур.</w:t>
+        <w:t>Делаю самостоятельно от идеи до рабочего продукта: интерфейс торгового стола, торговая стратегия, живой контур исполнения, режим тестирования на истории, сверка теста с боевой торговлей, подключение к брокеру.</w:t>
       </w:r>
     </w:p>
     <w:p>
       <w:r>
-        <w:t>• «Торговля» (Prod trade desk): live Z-score / спред, чеклист условий входа-выхода, AUTO-монитор, параметры (пороги Z, плечо, депозит, ТП), открытая позиция, прогноз PnL после закрытия (комиссии, overnight, bid/ask), история сделок; paper/prod execution path (Tinkoff Invest API).</w:t>
+        <w:t>• Вкладка «Торговля»: живой спред и отклонение от среднего, чеклист условий входа и выхода, автоматический монитор, настройки (пороги входа, плечо, депозит, тейк-профит), открытая позиция, прогноз результата после закрытия с учётом комиссий, переноса позиции и цен покупки/продажи, история сделок; исполнение через API Т-Инвестиций (учебный и боевой контур).</w:t>
       </w:r>
     </w:p>
     <w:p>
       <w:r>
-        <w:t>• «Тестирование»: bar-replay / симуляция на истории; heatmap порогов Z; equity/PnL и таблица сделок; Cap ON/OFF, slip, TP 1/2/3%; режимы M15 close vs «касание 1м» (tip-Z).</w:t>
+        <w:t>• Вкладка «Тестирование»: прогон стратегии по истории свечей, карта результатов по разным порогам входа, кривая капитала и таблица сделок; учёт проскальзывания и тейк-профита 1/2/3%; два режима сигнала — по закрытию 15-минутной свечи и по касанию порога на минутной свече.</w:t>
       </w:r>
     </w:p>
     <w:p>
       <w:r>
-        <w:t>• Паритет Test↔Prod: сверка сигналов/сделок, hourly digests, decision_bars (заморозка OHLC/Z в момент решения) — backtest без «рисования» входов задним числом.</w:t>
+        <w:t>• Сверка теста и боевой торговли: сравнение сигналов и сделок, почасовые сводки, фиксация рыночных данных в момент решения — чтобы тест не «рисовал» входы задним числом.</w:t>
       </w:r>
     </w:p>
     <w:p>
       <w:r>
-        <w:t>• Стратегия: mean-reversion по Z-score спреда TATN−TATNP (rolling μ/σ ~30д); вход/выход ±entry / ±exit (prod по умолчанию ±1.6 / ±1.3); эволюция closed M15 + settle → tip1m «касание порога»; учёт slip, комиссии ~0.04%/сторона, overnight ~0.033%/день; аналитика бимодального спреда (узкий / широкий / переход) в UI.</w:t>
+        <w:t>• Стратегия: возврат к среднему по спреду пары акций (скользящее среднее и разброс за ~30 дней); вход и выход по заданным порогам; учёт проскальзывания, комиссии (~0,04% на сторону) и платы за перенос (~0,033% в день); в интерфейсе — подсветка режимов спреда (узкий / широкий / переходный).</w:t>
       </w:r>
     </w:p>
     <w:p>
       <w:r>
-        <w:t>• Инженерия и observability: ISS market data (M15 из 10м + 1м tip), SQLite (replay + live_trading.db), health и checklist gating (session/broker/edge), Android WebView companion + rolling debug APK.</w:t>
+        <w:t>• Данные и надёжность: поток котировок Московской биржи (15-минутные свечи и минутный «кончик»), локальная база для истории и живой торговли, контроль готовности сессии/брокера/сигнала, мобильный компаньон на Android с актуальной отладочной сборкой.</w:t>
       </w:r>
     </w:p>
     <w:p>
       <w:r>
-        <w:t>• Стек: Python (FastAPI/uvicorn) live engine + Windows-служба watchdog; vanilla JS + Lightweight Charts (не React); Tinkoff Invest API (sandbox/prod).</w:t>
+        <w:t>• Технологии: Python (сервер и живой движок), веб-интерфейс на JavaScript с профессиональными графиками, API Т-Инвестиций; служба автозапуска на Windows.</w:t>
       </w:r>
     </w:p>
     <w:p>
       <w:r>
-        <w:t>One-liner: Built a full-stack MOEX pairs-trading desk (Python live engine + JS research/trading UI): Z-score mean-reversion on TATN/TATNP, 1m tip execution, backtest heatmap, Test↔Prod parity, and Tinkoff broker integration.</w:t>
+        <w:t>Кратко: полный цикл торгового стола на Московской бирже — стратегия, тестирование на истории, живая торговля, сверка теста с боем и интеграция с брокером.</w:t>
       </w:r>
     </w:p>
     <w:p/>

</xml_diff>

<commit_message>
Fully Russify markets resume project and key sections for HR
Co-authored-by: dimonix2019 <dimonix2019@users.noreply.github.com>
</commit_message>
<xml_diff>
--- a/Abramov_DN_resume_PO_markets.docx
+++ b/Abramov_DN_resume_PO_markets.docx
@@ -225,7 +225,7 @@
           <w:sz w:val="24"/>
           <w:lang w:val="ru-RU"/>
         </w:rPr>
-        <w:t>Менеджер продукта (PO) аналитических и торговых систем / prop-desk (фондовый рынок)</w:t>
+        <w:t>Менеджер продукта аналитических и торговых систем (фондовый рынок)</w:t>
       </w:r>
       <w:r>
         <w:rPr>
@@ -276,7 +276,7 @@
     </w:p>
     <w:p>
       <w:r>
-        <w:t>• Вкладка «Торговля»: живой спред и отклонение от среднего, чеклист условий входа и выхода, автоматический монитор, настройки (пороги входа, плечо, депозит, тейк-профит), открытая позиция, прогноз результата после закрытия с учётом комиссий, переноса позиции и цен покупки/продажи, история сделок; исполнение через API Т-Инвестиций (учебный и боевой контур).</w:t>
+        <w:t>• Вкладка «Торговля»: живой спред и отклонение от среднего, чеклист условий входа и выхода, автоматический монитор, настройки (пороги входа, плечо, депозит, фиксация прибыли), открытая позиция, прогноз результата после закрытия с учётом комиссий, переноса позиции и цен покупки/продажи, история сделок; исполнение через программный интерфейс Т-Инвестиций (учебный и боевой контур).</w:t>
       </w:r>
     </w:p>
     <w:p>
@@ -296,12 +296,12 @@
     </w:p>
     <w:p>
       <w:r>
-        <w:t>• Данные и надёжность: поток котировок Московской биржи (15-минутные свечи и минутный «кончик»), локальная база для истории и живой торговли, контроль готовности сессии/брокера/сигнала, мобильный компаньон на Android с актуальной отладочной сборкой.</w:t>
+        <w:t>• Данные и надёжность: поток котировок Московской биржи (15-минутные свечи и минутный «кончик»), локальная база для истории и живой торговли, контроль готовности сессии, брокера и сигнала, мобильное приложение-компаньон с актуальной отладочной сборкой.</w:t>
       </w:r>
     </w:p>
     <w:p>
       <w:r>
-        <w:t>• Технологии: Python (сервер и живой движок), веб-интерфейс на JavaScript с профессиональными графиками, API Т-Инвестиций; служба автозапуска на Windows.</w:t>
+        <w:t>• Технологии: серверная часть и живой торговый движок, веб-интерфейс с профессиональными графиками, подключение к Т-Инвестициям; служба автозапуска на рабочем компьютере.</w:t>
       </w:r>
     </w:p>
     <w:p>
@@ -317,12 +317,12 @@
     </w:p>
     <w:p>
       <w:r>
-        <w:t>Менеджер продукта аналитических и торговых систем / prop-desk на фондовом рынке. Строю торговый desk парного арбитража MOEX (TATN vs TATNP): стратегия и метрики → research/trading UI → live-исполнение → паритет backtest↔prod. Корпоративный опыт усиливает продукт: умею строить BI и управленческую отчётность для заказчика, понимаю устройство DWH (контуры, витрины, архитектура, ИБ), CI/CD и поставку изменений в промышленный контур. Сильный бэкграунд разработки ПО (C#, SQL, Python/FastAPI, JS, Android companion) — могу говорить с инженерами на одном языке и доводить продукт до рабочего экрана.</w:t>
+        <w:t>Менеджер продукта аналитических и торговых систем на фондовом рынке. Самостоятельно строю торговый стол парного арбитража на Московской бирже (ТАТНЕФТЬ обыкн. / привилегированные): стратегия и метрики → исследовательский и торговый интерфейс → живая торговля → сверка теста с боевой работой. Корпоративный опыт усиливает продукт: умею строить управленческую отчётность и аналитические панели для заказчика, понимаю устройство хранилищ данных (контуры, витрины, архитектура, информационная безопасность), непрерывную поставку изменений и вывод в промышленный контур. Сильный опыт разработки программ — могу говорить с инженерами на одном языке и доводить продукт до рабочего экрана.</w:t>
       </w:r>
     </w:p>
     <w:p>
       <w:r>
-        <w:t>Самостоятельно веду продукт от гипотезы до поставки; работаю с командой и стейкхолдерами; фокус на понятном desk, проверяемых решениях и видимом результате.</w:t>
+        <w:t>Самостоятельно веду продукт от гипотезы до поставки; работаю с командой и заинтересованными сторонами; фокус на понятном торговом столе, проверяемых решениях и видимом результате.</w:t>
       </w:r>
     </w:p>
     <w:p/>
@@ -357,32 +357,29 @@
           <w:sz w:val="20"/>
           <w:lang w:val="ru-RU"/>
         </w:rPr>
-        <w:t xml:space="preserve">—  Менеджер продукта / </w:t>
-      </w:r>
-      <w:r>
-        <w:rPr>
-          <w:rFonts w:ascii="Arial" w:eastAsia="Arial" w:hAnsi="Arial"/>
-          <w:color w:val="222222"/>
-          <w:sz w:val="20"/>
-        </w:rPr>
-        <w:t>Product</w:t>
-      </w:r>
-      <w:r>
-        <w:rPr>
-          <w:rFonts w:ascii="Arial" w:eastAsia="Arial" w:hAnsi="Arial"/>
-          <w:color w:val="222222"/>
-          <w:sz w:val="20"/>
-          <w:lang w:val="ru-RU"/>
-        </w:rPr>
-        <w:t xml:space="preserve"> </w:t>
-      </w:r>
-      <w:r>
-        <w:rPr>
-          <w:rFonts w:ascii="Arial" w:eastAsia="Arial" w:hAnsi="Arial"/>
-          <w:color w:val="222222"/>
-          <w:sz w:val="20"/>
-        </w:rPr>
-        <w:t>Owner</w:t>
+        <w:t>—  Менеджер продукта</w:t>
+      </w:r>
+      <w:r>
+        <w:rPr>
+          <w:rFonts w:ascii="Arial" w:eastAsia="Arial" w:hAnsi="Arial"/>
+          <w:color w:val="222222"/>
+          <w:sz w:val="20"/>
+        </w:rPr>
+      </w:r>
+      <w:r>
+        <w:rPr>
+          <w:rFonts w:ascii="Arial" w:eastAsia="Arial" w:hAnsi="Arial"/>
+          <w:color w:val="222222"/>
+          <w:sz w:val="20"/>
+          <w:lang w:val="ru-RU"/>
+        </w:rPr>
+      </w:r>
+      <w:r>
+        <w:rPr>
+          <w:rFonts w:ascii="Arial" w:eastAsia="Arial" w:hAnsi="Arial"/>
+          <w:color w:val="222222"/>
+          <w:sz w:val="20"/>
+        </w:rPr>
       </w:r>
     </w:p>
     <w:p>
@@ -476,7 +473,7 @@
     </w:p>
     <w:p>
       <w:r>
-        <w:t>Корпоративный опыт — BI и управленческая отчётность, DWH (контуры, витрины, архитектура, ИБ), CI/CD и промышленная поставка для заказчика.</w:t>
+        <w:t>Корпоративный опыт — управленческая отчётность и аналитика, хранилища данных (контуры, витрины, архитектура, информационная безопасность), непрерывная поставка изменений и промышленный контур для заказчика.</w:t>
       </w:r>
     </w:p>
     <w:p>
@@ -635,7 +632,7 @@
           <w:sz w:val="21"/>
           <w:lang w:val="ru-RU"/>
         </w:rPr>
-        <w:t xml:space="preserve">Технический руководитель проекта </w:t>
+        <w:t>Технический руководитель проекта хранилища данных</w:t>
       </w:r>
       <w:r>
         <w:rPr>
@@ -644,7 +641,6 @@
           <w:color w:val="222222"/>
           <w:sz w:val="21"/>
         </w:rPr>
-        <w:t>DWH</w:t>
       </w:r>
     </w:p>
     <w:p>
@@ -677,83 +673,74 @@
           <w:sz w:val="20"/>
           <w:lang w:val="ru-RU"/>
         </w:rPr>
-        <w:t xml:space="preserve">Создание </w:t>
-      </w:r>
-      <w:r>
-        <w:rPr>
-          <w:rFonts w:ascii="Arial" w:eastAsia="Arial" w:hAnsi="Arial"/>
-          <w:color w:val="222222"/>
-          <w:sz w:val="20"/>
-        </w:rPr>
-        <w:t>DWH</w:t>
-      </w:r>
-      <w:r>
-        <w:rPr>
-          <w:rFonts w:ascii="Arial" w:eastAsia="Arial" w:hAnsi="Arial"/>
-          <w:color w:val="222222"/>
-          <w:sz w:val="20"/>
-          <w:lang w:val="ru-RU"/>
-        </w:rPr>
-        <w:t xml:space="preserve"> на </w:t>
-      </w:r>
-      <w:r>
-        <w:rPr>
-          <w:rFonts w:ascii="Arial" w:eastAsia="Arial" w:hAnsi="Arial"/>
-          <w:color w:val="222222"/>
-          <w:sz w:val="20"/>
-        </w:rPr>
-        <w:t>open</w:t>
-      </w:r>
-      <w:r>
-        <w:rPr>
-          <w:rFonts w:ascii="Arial" w:eastAsia="Arial" w:hAnsi="Arial"/>
-          <w:color w:val="222222"/>
-          <w:sz w:val="20"/>
-          <w:lang w:val="ru-RU"/>
-        </w:rPr>
-        <w:t>-</w:t>
-      </w:r>
-      <w:r>
-        <w:rPr>
-          <w:rFonts w:ascii="Arial" w:eastAsia="Arial" w:hAnsi="Arial"/>
-          <w:color w:val="222222"/>
-          <w:sz w:val="20"/>
-        </w:rPr>
-        <w:t>source</w:t>
-      </w:r>
-      <w:r>
-        <w:rPr>
-          <w:rFonts w:ascii="Arial" w:eastAsia="Arial" w:hAnsi="Arial"/>
-          <w:color w:val="222222"/>
-          <w:sz w:val="20"/>
-          <w:lang w:val="ru-RU"/>
-        </w:rPr>
-        <w:t xml:space="preserve"> стеке: архитектура, инфраструктура, контуры загрузки, витрины; затем подключение </w:t>
-      </w:r>
-      <w:r>
-        <w:rPr>
-          <w:rFonts w:ascii="Arial" w:eastAsia="Arial" w:hAnsi="Arial"/>
-          <w:color w:val="222222"/>
-          <w:sz w:val="20"/>
-        </w:rPr>
-        <w:t>BI</w:t>
-      </w:r>
-      <w:r>
-        <w:rPr>
-          <w:rFonts w:ascii="Arial" w:eastAsia="Arial" w:hAnsi="Arial"/>
-          <w:color w:val="222222"/>
-          <w:sz w:val="20"/>
-          <w:lang w:val="ru-RU"/>
-        </w:rPr>
-        <w:t xml:space="preserve">. </w:t>
-      </w:r>
-      <w:r>
-        <w:rPr>
-          <w:rFonts w:ascii="Arial" w:eastAsia="Arial" w:hAnsi="Arial"/>
-          <w:color w:val="222222"/>
-          <w:sz w:val="20"/>
-        </w:rPr>
-        <w:t>Выстроен CI/CD для поставки изменений по контурам хранилища.</w:t>
+        <w:t>Создание хранилища данных на открытых технологиях: архитектура, инфраструктура, контуры загрузки, витрины; затем подключение аналитической отчётности. Выстроена непрерывная поставка изменений для поставки изменений по контурам хранилища.</w:t>
+      </w:r>
+      <w:r>
+        <w:rPr>
+          <w:rFonts w:ascii="Arial" w:eastAsia="Arial" w:hAnsi="Arial"/>
+          <w:color w:val="222222"/>
+          <w:sz w:val="20"/>
+        </w:rPr>
+      </w:r>
+      <w:r>
+        <w:rPr>
+          <w:rFonts w:ascii="Arial" w:eastAsia="Arial" w:hAnsi="Arial"/>
+          <w:color w:val="222222"/>
+          <w:sz w:val="20"/>
+          <w:lang w:val="ru-RU"/>
+        </w:rPr>
+      </w:r>
+      <w:r>
+        <w:rPr>
+          <w:rFonts w:ascii="Arial" w:eastAsia="Arial" w:hAnsi="Arial"/>
+          <w:color w:val="222222"/>
+          <w:sz w:val="20"/>
+        </w:rPr>
+      </w:r>
+      <w:r>
+        <w:rPr>
+          <w:rFonts w:ascii="Arial" w:eastAsia="Arial" w:hAnsi="Arial"/>
+          <w:color w:val="222222"/>
+          <w:sz w:val="20"/>
+          <w:lang w:val="ru-RU"/>
+        </w:rPr>
+      </w:r>
+      <w:r>
+        <w:rPr>
+          <w:rFonts w:ascii="Arial" w:eastAsia="Arial" w:hAnsi="Arial"/>
+          <w:color w:val="222222"/>
+          <w:sz w:val="20"/>
+        </w:rPr>
+      </w:r>
+      <w:r>
+        <w:rPr>
+          <w:rFonts w:ascii="Arial" w:eastAsia="Arial" w:hAnsi="Arial"/>
+          <w:color w:val="222222"/>
+          <w:sz w:val="20"/>
+          <w:lang w:val="ru-RU"/>
+        </w:rPr>
+      </w:r>
+      <w:r>
+        <w:rPr>
+          <w:rFonts w:ascii="Arial" w:eastAsia="Arial" w:hAnsi="Arial"/>
+          <w:color w:val="222222"/>
+          <w:sz w:val="20"/>
+        </w:rPr>
+      </w:r>
+      <w:r>
+        <w:rPr>
+          <w:rFonts w:ascii="Arial" w:eastAsia="Arial" w:hAnsi="Arial"/>
+          <w:color w:val="222222"/>
+          <w:sz w:val="20"/>
+          <w:lang w:val="ru-RU"/>
+        </w:rPr>
+      </w:r>
+      <w:r>
+        <w:rPr>
+          <w:rFonts w:ascii="Arial" w:eastAsia="Arial" w:hAnsi="Arial"/>
+          <w:color w:val="222222"/>
+          <w:sz w:val="20"/>
+        </w:rPr>
       </w:r>
     </w:p>
     <w:p>
@@ -845,92 +832,82 @@
           <w:sz w:val="20"/>
           <w:lang w:val="ru-RU"/>
         </w:rPr>
-        <w:t xml:space="preserve">Согласованы ключевые документы (цели, </w:t>
-      </w:r>
-      <w:r>
-        <w:rPr>
-          <w:rFonts w:ascii="Arial" w:eastAsia="Arial" w:hAnsi="Arial"/>
-          <w:color w:val="222222"/>
-          <w:sz w:val="20"/>
-        </w:rPr>
-        <w:t>RoadMap</w:t>
-      </w:r>
-      <w:r>
-        <w:rPr>
-          <w:rFonts w:ascii="Arial" w:eastAsia="Arial" w:hAnsi="Arial"/>
-          <w:color w:val="222222"/>
-          <w:sz w:val="20"/>
-          <w:lang w:val="ru-RU"/>
-        </w:rPr>
-        <w:t xml:space="preserve">, концептуальный дизайн, БТ, ТЗ) с ИТ, ИБ и бизнесом; совместно со </w:t>
-      </w:r>
-      <w:r>
-        <w:rPr>
-          <w:rFonts w:ascii="Arial" w:eastAsia="Arial" w:hAnsi="Arial"/>
-          <w:color w:val="222222"/>
-          <w:sz w:val="20"/>
-        </w:rPr>
-        <w:t>Scrum</w:t>
-      </w:r>
-      <w:r>
-        <w:rPr>
-          <w:rFonts w:ascii="Arial" w:eastAsia="Arial" w:hAnsi="Arial"/>
-          <w:color w:val="222222"/>
-          <w:sz w:val="20"/>
-          <w:lang w:val="ru-RU"/>
-        </w:rPr>
-        <w:t xml:space="preserve">-мастером внедрены </w:t>
-      </w:r>
-      <w:r>
-        <w:rPr>
-          <w:rFonts w:ascii="Arial" w:eastAsia="Arial" w:hAnsi="Arial"/>
-          <w:color w:val="222222"/>
-          <w:sz w:val="20"/>
-        </w:rPr>
-        <w:t>Agile</w:t>
-      </w:r>
-      <w:r>
-        <w:rPr>
-          <w:rFonts w:ascii="Arial" w:eastAsia="Arial" w:hAnsi="Arial"/>
-          <w:color w:val="222222"/>
-          <w:sz w:val="20"/>
-          <w:lang w:val="ru-RU"/>
-        </w:rPr>
-        <w:t xml:space="preserve">-процессы; организован </w:t>
-      </w:r>
-      <w:r>
-        <w:rPr>
-          <w:rFonts w:ascii="Arial" w:eastAsia="Arial" w:hAnsi="Arial"/>
-          <w:color w:val="222222"/>
-          <w:sz w:val="20"/>
-        </w:rPr>
-        <w:t>CI</w:t>
-      </w:r>
-      <w:r>
-        <w:rPr>
-          <w:rFonts w:ascii="Arial" w:eastAsia="Arial" w:hAnsi="Arial"/>
-          <w:color w:val="222222"/>
-          <w:sz w:val="20"/>
-          <w:lang w:val="ru-RU"/>
-        </w:rPr>
-        <w:t>/</w:t>
-      </w:r>
-      <w:r>
-        <w:rPr>
-          <w:rFonts w:ascii="Arial" w:eastAsia="Arial" w:hAnsi="Arial"/>
-          <w:color w:val="222222"/>
-          <w:sz w:val="20"/>
-        </w:rPr>
-        <w:t>CD</w:t>
-      </w:r>
-      <w:r>
-        <w:rPr>
-          <w:rFonts w:ascii="Arial" w:eastAsia="Arial" w:hAnsi="Arial"/>
-          <w:color w:val="222222"/>
-          <w:sz w:val="20"/>
-          <w:lang w:val="ru-RU"/>
-        </w:rPr>
-        <w:t>.</w:t>
+        <w:t>Согласованы ключевые документы (цели, RoadMap, концептуальный дизайн, БТ, ТЗ) с ИТ, ИБ и бизнесом; совместно со Scrum-мастером внедрены Agile-процессы; организована непрерывная поставка изменений.</w:t>
+      </w:r>
+      <w:r>
+        <w:rPr>
+          <w:rFonts w:ascii="Arial" w:eastAsia="Arial" w:hAnsi="Arial"/>
+          <w:color w:val="222222"/>
+          <w:sz w:val="20"/>
+        </w:rPr>
+      </w:r>
+      <w:r>
+        <w:rPr>
+          <w:rFonts w:ascii="Arial" w:eastAsia="Arial" w:hAnsi="Arial"/>
+          <w:color w:val="222222"/>
+          <w:sz w:val="20"/>
+          <w:lang w:val="ru-RU"/>
+        </w:rPr>
+      </w:r>
+      <w:r>
+        <w:rPr>
+          <w:rFonts w:ascii="Arial" w:eastAsia="Arial" w:hAnsi="Arial"/>
+          <w:color w:val="222222"/>
+          <w:sz w:val="20"/>
+        </w:rPr>
+      </w:r>
+      <w:r>
+        <w:rPr>
+          <w:rFonts w:ascii="Arial" w:eastAsia="Arial" w:hAnsi="Arial"/>
+          <w:color w:val="222222"/>
+          <w:sz w:val="20"/>
+          <w:lang w:val="ru-RU"/>
+        </w:rPr>
+      </w:r>
+      <w:r>
+        <w:rPr>
+          <w:rFonts w:ascii="Arial" w:eastAsia="Arial" w:hAnsi="Arial"/>
+          <w:color w:val="222222"/>
+          <w:sz w:val="20"/>
+        </w:rPr>
+      </w:r>
+      <w:r>
+        <w:rPr>
+          <w:rFonts w:ascii="Arial" w:eastAsia="Arial" w:hAnsi="Arial"/>
+          <w:color w:val="222222"/>
+          <w:sz w:val="20"/>
+          <w:lang w:val="ru-RU"/>
+        </w:rPr>
+      </w:r>
+      <w:r>
+        <w:rPr>
+          <w:rFonts w:ascii="Arial" w:eastAsia="Arial" w:hAnsi="Arial"/>
+          <w:color w:val="222222"/>
+          <w:sz w:val="20"/>
+        </w:rPr>
+      </w:r>
+      <w:r>
+        <w:rPr>
+          <w:rFonts w:ascii="Arial" w:eastAsia="Arial" w:hAnsi="Arial"/>
+          <w:color w:val="222222"/>
+          <w:sz w:val="20"/>
+          <w:lang w:val="ru-RU"/>
+        </w:rPr>
+      </w:r>
+      <w:r>
+        <w:rPr>
+          <w:rFonts w:ascii="Arial" w:eastAsia="Arial" w:hAnsi="Arial"/>
+          <w:color w:val="222222"/>
+          <w:sz w:val="20"/>
+        </w:rPr>
+      </w:r>
+      <w:r>
+        <w:rPr>
+          <w:rFonts w:ascii="Arial" w:eastAsia="Arial" w:hAnsi="Arial"/>
+          <w:color w:val="222222"/>
+          <w:sz w:val="20"/>
+          <w:lang w:val="ru-RU"/>
+        </w:rPr>
       </w:r>
     </w:p>
     <w:p>
@@ -973,41 +950,37 @@
           <w:sz w:val="20"/>
           <w:lang w:val="ru-RU"/>
         </w:rPr>
-        <w:t xml:space="preserve">Техническое руководство проектом создания </w:t>
-      </w:r>
-      <w:r>
-        <w:rPr>
-          <w:rFonts w:ascii="Arial" w:eastAsia="Arial" w:hAnsi="Arial"/>
-          <w:color w:val="222222"/>
-          <w:sz w:val="20"/>
-        </w:rPr>
-        <w:t>DWH</w:t>
-      </w:r>
-      <w:r>
-        <w:rPr>
-          <w:rFonts w:ascii="Arial" w:eastAsia="Arial" w:hAnsi="Arial"/>
-          <w:color w:val="222222"/>
-          <w:sz w:val="20"/>
-          <w:lang w:val="ru-RU"/>
-        </w:rPr>
-        <w:t xml:space="preserve">: архитектура, инфраструктура, контуры загрузки, витрины; подключение </w:t>
-      </w:r>
-      <w:r>
-        <w:rPr>
-          <w:rFonts w:ascii="Arial" w:eastAsia="Arial" w:hAnsi="Arial"/>
-          <w:color w:val="222222"/>
-          <w:sz w:val="20"/>
-        </w:rPr>
-        <w:t>BI</w:t>
-      </w:r>
-      <w:r>
-        <w:rPr>
-          <w:rFonts w:ascii="Arial" w:eastAsia="Arial" w:hAnsi="Arial"/>
-          <w:color w:val="222222"/>
-          <w:sz w:val="20"/>
-          <w:lang w:val="ru-RU"/>
-        </w:rPr>
-        <w:t xml:space="preserve"> после готовности контуров хранилища.</w:t>
+        <w:t>Техническое руководство проектом создания DWH: архитектура, инфраструктура, контуры загрузки, витрины; подключение аналитической отчётности после готовности контуров хранилища.</w:t>
+      </w:r>
+      <w:r>
+        <w:rPr>
+          <w:rFonts w:ascii="Arial" w:eastAsia="Arial" w:hAnsi="Arial"/>
+          <w:color w:val="222222"/>
+          <w:sz w:val="20"/>
+        </w:rPr>
+      </w:r>
+      <w:r>
+        <w:rPr>
+          <w:rFonts w:ascii="Arial" w:eastAsia="Arial" w:hAnsi="Arial"/>
+          <w:color w:val="222222"/>
+          <w:sz w:val="20"/>
+          <w:lang w:val="ru-RU"/>
+        </w:rPr>
+      </w:r>
+      <w:r>
+        <w:rPr>
+          <w:rFonts w:ascii="Arial" w:eastAsia="Arial" w:hAnsi="Arial"/>
+          <w:color w:val="222222"/>
+          <w:sz w:val="20"/>
+        </w:rPr>
+      </w:r>
+      <w:r>
+        <w:rPr>
+          <w:rFonts w:ascii="Arial" w:eastAsia="Arial" w:hAnsi="Arial"/>
+          <w:color w:val="222222"/>
+          <w:sz w:val="20"/>
+          <w:lang w:val="ru-RU"/>
+        </w:rPr>
       </w:r>
     </w:p>
     <w:p>
@@ -1079,58 +1052,52 @@
           <w:sz w:val="20"/>
           <w:lang w:val="ru-RU"/>
         </w:rPr>
-        <w:t xml:space="preserve">Контроль скоупа, рисков и сроков; защита проекта перед бизнесом; </w:t>
-      </w:r>
-      <w:r>
-        <w:rPr>
-          <w:rFonts w:ascii="Arial" w:eastAsia="Arial" w:hAnsi="Arial"/>
-          <w:color w:val="222222"/>
-          <w:sz w:val="20"/>
-        </w:rPr>
-        <w:t>RoadMap</w:t>
-      </w:r>
-      <w:r>
-        <w:rPr>
-          <w:rFonts w:ascii="Arial" w:eastAsia="Arial" w:hAnsi="Arial"/>
-          <w:color w:val="222222"/>
-          <w:sz w:val="20"/>
-          <w:lang w:val="ru-RU"/>
-        </w:rPr>
-        <w:t xml:space="preserve"> и проектные документы; развитие </w:t>
-      </w:r>
-      <w:r>
-        <w:rPr>
-          <w:rFonts w:ascii="Arial" w:eastAsia="Arial" w:hAnsi="Arial"/>
-          <w:color w:val="222222"/>
-          <w:sz w:val="20"/>
-        </w:rPr>
-        <w:t>CI</w:t>
-      </w:r>
-      <w:r>
-        <w:rPr>
-          <w:rFonts w:ascii="Arial" w:eastAsia="Arial" w:hAnsi="Arial"/>
-          <w:color w:val="222222"/>
-          <w:sz w:val="20"/>
-          <w:lang w:val="ru-RU"/>
-        </w:rPr>
-        <w:t>/</w:t>
-      </w:r>
-      <w:r>
-        <w:rPr>
-          <w:rFonts w:ascii="Arial" w:eastAsia="Arial" w:hAnsi="Arial"/>
-          <w:color w:val="222222"/>
-          <w:sz w:val="20"/>
-        </w:rPr>
-        <w:t>CD</w:t>
-      </w:r>
-      <w:r>
-        <w:rPr>
-          <w:rFonts w:ascii="Arial" w:eastAsia="Arial" w:hAnsi="Arial"/>
-          <w:color w:val="222222"/>
-          <w:sz w:val="20"/>
-          <w:lang w:val="ru-RU"/>
-        </w:rPr>
-        <w:t>.</w:t>
+        <w:t>Контроль скоупа, рисков и сроков; защита проекта перед бизнесом; RoadMap и проектные документы; развитие непрерывной поставки изменений.</w:t>
+      </w:r>
+      <w:r>
+        <w:rPr>
+          <w:rFonts w:ascii="Arial" w:eastAsia="Arial" w:hAnsi="Arial"/>
+          <w:color w:val="222222"/>
+          <w:sz w:val="20"/>
+        </w:rPr>
+      </w:r>
+      <w:r>
+        <w:rPr>
+          <w:rFonts w:ascii="Arial" w:eastAsia="Arial" w:hAnsi="Arial"/>
+          <w:color w:val="222222"/>
+          <w:sz w:val="20"/>
+          <w:lang w:val="ru-RU"/>
+        </w:rPr>
+      </w:r>
+      <w:r>
+        <w:rPr>
+          <w:rFonts w:ascii="Arial" w:eastAsia="Arial" w:hAnsi="Arial"/>
+          <w:color w:val="222222"/>
+          <w:sz w:val="20"/>
+        </w:rPr>
+      </w:r>
+      <w:r>
+        <w:rPr>
+          <w:rFonts w:ascii="Arial" w:eastAsia="Arial" w:hAnsi="Arial"/>
+          <w:color w:val="222222"/>
+          <w:sz w:val="20"/>
+          <w:lang w:val="ru-RU"/>
+        </w:rPr>
+      </w:r>
+      <w:r>
+        <w:rPr>
+          <w:rFonts w:ascii="Arial" w:eastAsia="Arial" w:hAnsi="Arial"/>
+          <w:color w:val="222222"/>
+          <w:sz w:val="20"/>
+        </w:rPr>
+      </w:r>
+      <w:r>
+        <w:rPr>
+          <w:rFonts w:ascii="Arial" w:eastAsia="Arial" w:hAnsi="Arial"/>
+          <w:color w:val="222222"/>
+          <w:sz w:val="20"/>
+          <w:lang w:val="ru-RU"/>
+        </w:rPr>
       </w:r>
     </w:p>
     <w:p>
@@ -3441,7 +3408,7 @@
           <w:sz w:val="20"/>
           <w:lang w:val="ru-RU"/>
         </w:rPr>
-        <w:t xml:space="preserve">2025  </w:t>
+        <w:t>2025  Аренадата. Архитектура хранилищ данных</w:t>
       </w:r>
       <w:r>
         <w:rPr>
@@ -3451,7 +3418,6 @@
           <w:sz w:val="21"/>
           <w:lang w:val="ru-RU"/>
         </w:rPr>
-        <w:t>Аренадата</w:t>
       </w:r>
       <w:proofErr w:type="gramEnd"/>
       <w:r>
@@ -3462,7 +3428,6 @@
           <w:sz w:val="21"/>
           <w:lang w:val="ru-RU"/>
         </w:rPr>
-        <w:t xml:space="preserve">. Архитектура </w:t>
       </w:r>
       <w:r>
         <w:rPr>
@@ -3471,7 +3436,6 @@
           <w:color w:val="222222"/>
           <w:sz w:val="21"/>
         </w:rPr>
-        <w:t>DWH</w:t>
       </w:r>
     </w:p>
     <w:p>
@@ -3488,7 +3452,7 @@
           <w:sz w:val="19"/>
           <w:lang w:val="ru-RU"/>
         </w:rPr>
-        <w:t xml:space="preserve">Аренадата, Архитектура </w:t>
+        <w:t>Аренадата, Архитектура хранилищ данных</w:t>
       </w:r>
       <w:r>
         <w:rPr>
@@ -3496,7 +3460,6 @@
           <w:color w:val="666666"/>
           <w:sz w:val="19"/>
         </w:rPr>
-        <w:t>DWH</w:t>
       </w:r>
     </w:p>
     <w:p>
@@ -4544,7 +4507,7 @@
           <w:color w:val="222222"/>
           <w:sz w:val="20"/>
         </w:rPr>
-        <w:t>Product ownership  ·  Prop-desk / trading desk  ·  Парный арбитраж (MOEX)  ·  Z-score / mean-reversion  ·  Live trading monitor  ·  Backtest &amp; Test↔Prod parity  ·  Market data (MOEX ISS)  ·  Research UI (replay, heatmap, equity)  ·  Tinkoff Invest API  ·  Python / FastAPI  ·  Lightweight Charts  ·  Разработка ПО  ·  BI / дашборды  ·  QlikView / QlikSense  ·  DWH / витрины данных  ·  CI/CD  ·  Discovery → метрики → UI → обратная связь  ·  Roadmap / бэклог  ·  SQL  ·  Agile / Scrum</w:t>
+        <w:t>Управление продуктом  ·  Торговый стол  ·  Парный арбитраж  ·  Московская биржа  ·  Стратегии возврата к среднему  ·  Живой торговый монитор  ·  Сверка теста и боевой торговли  ·  Рыночные данные  ·  Исследовательский интерфейс  ·  Т-Инвестиции  ·  Разработка программ  ·  Аналитические панели  ·  Управленческая отчётность  ·  Хранилища данных  ·  Непрерывная поставка  ·  Поиск потребностей → метрики → экран → обратная связь  ·  Дорожная карта и бэклог  ·  Запросы к данным  ·  Гибкая разработка</w:t>
       </w:r>
       <w:r>
         <w:rPr>

</xml_diff>

<commit_message>
Remove leftover English terms from markets resume
Co-authored-by: dimonix2019 <dimonix2019@users.noreply.github.com>
</commit_message>
<xml_diff>
--- a/Abramov_DN_resume_PO_markets.docx
+++ b/Abramov_DN_resume_PO_markets.docx
@@ -281,7 +281,7 @@
     </w:p>
     <w:p>
       <w:r>
-        <w:t>• Вкладка «Тестирование»: прогон стратегии по истории свечей, карта результатов по разным порогам входа, кривая капитала и таблица сделок; учёт проскальзывания и тейк-профита 1/2/3%; два режима сигнала — по закрытию 15-минутной свечи и по касанию порога на минутной свече.</w:t>
+        <w:t>• Вкладка «Тестирование»: прогон стратегии по истории свечей, карта результатов по разным порогам входа, кривая капитала и таблица сделок; учёт проскальзывания и фиксации прибыли 1/2/3%; два режима сигнала — по закрытию 15-минутной свечи и по касанию порога на минутной свече.</w:t>
       </w:r>
     </w:p>
     <w:p>
@@ -794,7 +794,7 @@
           <w:sz w:val="20"/>
           <w:lang w:val="ru-RU"/>
         </w:rPr>
-        <w:t xml:space="preserve">Финансы и закупки проекта; контроль бюджета, рисков и </w:t>
+        <w:t>Финансы и закупки проекта; контроль бюджета, рисков и состава работ; защита статуса перед бизнесом.</w:t>
       </w:r>
       <w:proofErr w:type="spellStart"/>
       <w:r>
@@ -804,7 +804,6 @@
           <w:sz w:val="20"/>
           <w:lang w:val="ru-RU"/>
         </w:rPr>
-        <w:t>скоупа</w:t>
       </w:r>
       <w:proofErr w:type="spellEnd"/>
       <w:r>
@@ -814,7 +813,6 @@
           <w:sz w:val="20"/>
           <w:lang w:val="ru-RU"/>
         </w:rPr>
-        <w:t>; защита статуса перед бизнесом.</w:t>
       </w:r>
     </w:p>
     <w:p>
@@ -832,7 +830,7 @@
           <w:sz w:val="20"/>
           <w:lang w:val="ru-RU"/>
         </w:rPr>
-        <w:t>Согласованы ключевые документы (цели, RoadMap, концептуальный дизайн, БТ, ТЗ) с ИТ, ИБ и бизнесом; совместно со Scrum-мастером внедрены Agile-процессы; организована непрерывная поставка изменений.</w:t>
+        <w:t>Согласованы ключевые документы (цели, дорожная карта, концептуальный дизайн, БТ, ТЗ) с ИТ, ИБ и бизнесом; совместно со Scrum-мастером внедрены Agile-процессы; организована непрерывная поставка изменений.</w:t>
       </w:r>
       <w:r>
         <w:rPr>
@@ -950,7 +948,7 @@
           <w:sz w:val="20"/>
           <w:lang w:val="ru-RU"/>
         </w:rPr>
-        <w:t>Техническое руководство проектом создания DWH: архитектура, инфраструктура, контуры загрузки, витрины; подключение аналитической отчётности после готовности контуров хранилища.</w:t>
+        <w:t>Техническое руководство проектом создания хранилища данных: архитектура, инфраструктура, контуры загрузки, витрины; подключение аналитической отчётности после готовности контуров хранилища.</w:t>
       </w:r>
       <w:r>
         <w:rPr>
@@ -1052,7 +1050,7 @@
           <w:sz w:val="20"/>
           <w:lang w:val="ru-RU"/>
         </w:rPr>
-        <w:t>Контроль скоупа, рисков и сроков; защита проекта перед бизнесом; RoadMap и проектные документы; развитие непрерывной поставки изменений.</w:t>
+        <w:t>Контроль состава работ, рисков и сроков; защита проекта перед бизнесом; дорожная карта и проектные документы; развитие непрерывной поставки изменений.</w:t>
       </w:r>
       <w:r>
         <w:rPr>

</xml_diff>

<commit_message>
Note AI-assisted development of Moex trading dashboard
Co-authored-by: dimonix2019 <dimonix2019@users.noreply.github.com>
</commit_message>
<xml_diff>
--- a/Abramov_DN_resume_PO_markets.docx
+++ b/Abramov_DN_resume_PO_markets.docx
@@ -266,12 +266,12 @@
     </w:p>
     <w:p>
       <w:r>
-        <w:t>Личный продукт: торговый дашборд парного арбитража акций Московской биржи (ТАТНЕФТЬ обыкн. / привилегированные)</w:t>
+        <w:t>Личный продукт: торговый дашборд парного арбитража акций Московской биржи (ТАТНЕФТЬ обыкн. / привилегированные); разрабатываю с использованием искусственного интеллекта</w:t>
       </w:r>
     </w:p>
     <w:p>
       <w:r>
-        <w:t>Делаю самостоятельно от идеи до рабочего продукта: интерфейс торгового стола, торговая стратегия, живой контур исполнения, режим тестирования на истории, сверка теста с боевой торговлей, подключение к брокеру.</w:t>
+        <w:t>Делаю самостоятельно от идеи до рабочего продукта с применением ИИ: интерфейс торгового стола, торговая стратегия, живой контур исполнения, режим тестирования на истории, сверка теста с боевой торговлей, подключение к брокеру.</w:t>
       </w:r>
     </w:p>
     <w:p>
@@ -306,7 +306,7 @@
     </w:p>
     <w:p>
       <w:r>
-        <w:t>Кратко: полный цикл торгового стола на Московской бирже — стратегия, тестирование на истории, живая торговля, сверка теста с боем и интеграция с брокером.</w:t>
+        <w:t>Кратко: полный цикл торгового стола на Московской бирже с использованием ИИ — стратегия, тестирование на истории, живая торговля, сверка теста с боем и интеграция с брокером.</w:t>
       </w:r>
     </w:p>
     <w:p/>
@@ -317,7 +317,7 @@
     </w:p>
     <w:p>
       <w:r>
-        <w:t>Менеджер продукта аналитических и торговых систем на фондовом рынке. Самостоятельно строю торговый стол парного арбитража на Московской бирже (ТАТНЕФТЬ обыкн. / привилегированные): стратегия и метрики → исследовательский и торговый интерфейс → живая торговля → сверка теста с боевой работой. Корпоративный опыт усиливает продукт: умею строить управленческую отчётность и аналитические панели для заказчика, понимаю устройство хранилищ данных (контуры, витрины, архитектура, информационная безопасность), непрерывную поставку изменений и вывод в промышленный контур. Сильный опыт разработки программ — могу говорить с инженерами на одном языке и доводить продукт до рабочего экрана.</w:t>
+        <w:t>Менеджер продукта аналитических и торговых систем на фондовом рынке. Самостоятельно строю с использованием ИИ торговый стол парного арбитража на Московской бирже (ТАТНЕФТЬ обыкн. / привилегированные): стратегия и метрики → исследовательский и торговый интерфейс → живая торговля → сверка теста с боевой работой. Корпоративный опыт усиливает продукт: умею строить управленческую отчётность и аналитические панели для заказчика, понимаю устройство хранилищ данных (контуры, витрины, архитектура, информационная безопасность), непрерывную поставку изменений и вывод в промышленный контур. Сильный опыт разработки программ — могу говорить с инженерами на одном языке и доводить продукт до рабочего экрана.</w:t>
       </w:r>
     </w:p>
     <w:p>
@@ -4505,7 +4505,7 @@
           <w:color w:val="222222"/>
           <w:sz w:val="20"/>
         </w:rPr>
-        <w:t>Управление продуктом  ·  Торговый стол  ·  Парный арбитраж  ·  Московская биржа  ·  Стратегии возврата к среднему  ·  Живой торговый монитор  ·  Сверка теста и боевой торговли  ·  Рыночные данные  ·  Исследовательский интерфейс  ·  Т-Инвестиции  ·  Разработка программ  ·  Аналитические панели  ·  Управленческая отчётность  ·  Хранилища данных  ·  Непрерывная поставка  ·  Поиск потребностей → метрики → экран → обратная связь  ·  Дорожная карта и бэклог  ·  Запросы к данным  ·  Гибкая разработка</w:t>
+        <w:t>Управление продуктом  ·  Торговый стол  ·  Разработка с ИИ  ·  Парный арбитраж  ·  Московская биржа  ·  Стратегии возврата к среднему  ·  Живой торговый монитор  ·  Сверка теста и боевой торговли  ·  Рыночные данные  ·  Исследовательский интерфейс  ·  Т-Инвестиции  ·  Разработка программ  ·  Аналитические панели  ·  Управленческая отчётность  ·  Хранилища данных  ·  Непрерывная поставка  ·  Поиск потребностей → метрики → экран → обратная связь  ·  Дорожная карта и бэклог  ·  Запросы к данным  ·  Гибкая разработка</w:t>
       </w:r>
       <w:r>
         <w:rPr>

</xml_diff>

<commit_message>
Shorten Moex project to dashboard features only
Co-authored-by: dimonix2019 <dimonix2019@users.noreply.github.com>
</commit_message>
<xml_diff>
--- a/Abramov_DN_resume_PO_markets.docx
+++ b/Abramov_DN_resume_PO_markets.docx
@@ -266,47 +266,22 @@
     </w:p>
     <w:p>
       <w:r>
-        <w:t>Личный продукт: торговый дашборд парного арбитража акций Московской биржи (ТАТНЕФТЬ обыкн. / привилегированные); разрабатываю с использованием искусственного интеллекта</w:t>
+        <w:t>Личный продукт: торговый дашборд парного арбитража на Московской бирже; разрабатываю самостоятельно с использованием ИИ.</w:t>
       </w:r>
     </w:p>
     <w:p>
       <w:r>
-        <w:t>Делаю самостоятельно от идеи до рабочего продукта с применением ИИ: интерфейс торгового стола, торговая стратегия, живой контур исполнения, режим тестирования на истории, сверка теста с боевой торговлей, подключение к брокеру.</w:t>
+        <w:t>• «Торговля»: живой спред, условия входа и выхода, открытая позиция, прогноз результата, история сделок, исполнение через Т-Инвестиции.</w:t>
       </w:r>
     </w:p>
     <w:p>
       <w:r>
-        <w:t>• Вкладка «Торговля»: живой спред и отклонение от среднего, чеклист условий входа и выхода, автоматический монитор, настройки (пороги входа, плечо, депозит, фиксация прибыли), открытая позиция, прогноз результата после закрытия с учётом комиссий, переноса позиции и цен покупки/продажи, история сделок; исполнение через программный интерфейс Т-Инвестиций (учебный и боевой контур).</w:t>
+        <w:t>• «Тестирование»: прогон на истории, сравнение порогов, кривая капитала, таблица сделок.</w:t>
       </w:r>
     </w:p>
     <w:p>
       <w:r>
-        <w:t>• Вкладка «Тестирование»: прогон стратегии по истории свечей, карта результатов по разным порогам входа, кривая капитала и таблица сделок; учёт проскальзывания и фиксации прибыли 1/2/3%; два режима сигнала — по закрытию 15-минутной свечи и по касанию порога на минутной свече.</w:t>
-      </w:r>
-    </w:p>
-    <w:p>
-      <w:r>
-        <w:t>• Сверка теста и боевой торговли: сравнение сигналов и сделок, почасовые сводки, фиксация рыночных данных в момент решения — чтобы тест не «рисовал» входы задним числом.</w:t>
-      </w:r>
-    </w:p>
-    <w:p>
-      <w:r>
-        <w:t>• Стратегия: возврат к среднему по спреду пары акций (скользящее среднее и разброс за ~30 дней); вход и выход по заданным порогам; учёт проскальзывания, комиссии (~0,04% на сторону) и платы за перенос (~0,033% в день); в интерфейсе — подсветка режимов спреда (узкий / широкий / переходный).</w:t>
-      </w:r>
-    </w:p>
-    <w:p>
-      <w:r>
-        <w:t>• Данные и надёжность: поток котировок Московской биржи (15-минутные свечи и минутный «кончик»), локальная база для истории и живой торговли, контроль готовности сессии, брокера и сигнала, мобильное приложение-компаньон с актуальной отладочной сборкой.</w:t>
-      </w:r>
-    </w:p>
-    <w:p>
-      <w:r>
-        <w:t>• Технологии: серверная часть и живой торговый движок, веб-интерфейс с профессиональными графиками, подключение к Т-Инвестициям; служба автозапуска на рабочем компьютере.</w:t>
-      </w:r>
-    </w:p>
-    <w:p>
-      <w:r>
-        <w:t>Кратко: полный цикл торгового стола на Московской бирже с использованием ИИ — стратегия, тестирование на истории, живая торговля, сверка теста с боем и интеграция с брокером.</w:t>
+        <w:t>• Сверка теста и боевой торговли; контроль готовности; мобильное приложение-компаньон.</w:t>
       </w:r>
     </w:p>
     <w:p/>
@@ -317,7 +292,7 @@
     </w:p>
     <w:p>
       <w:r>
-        <w:t>Менеджер продукта аналитических и торговых систем на фондовом рынке. Самостоятельно строю с использованием ИИ торговый стол парного арбитража на Московской бирже (ТАТНЕФТЬ обыкн. / привилегированные): стратегия и метрики → исследовательский и торговый интерфейс → живая торговля → сверка теста с боевой работой. Корпоративный опыт усиливает продукт: умею строить управленческую отчётность и аналитические панели для заказчика, понимаю устройство хранилищ данных (контуры, витрины, архитектура, информационная безопасность), непрерывную поставку изменений и вывод в промышленный контур. Сильный опыт разработки программ — могу говорить с инженерами на одном языке и доводить продукт до рабочего экрана.</w:t>
+        <w:t>Менеджер продукта аналитических и торговых систем на фондовом рынке. Самостоятельно с использованием ИИ развиваю торговый дашборд парного арбитража на Московской бирже: торговый экран, тестирование на истории, сверка с боевой торговлей, подключение к брокеру. Корпоративный опыт усиливает продукт: управленческая отчётность и аналитические панели для заказчика, хранилища данных (контуры, витрины, архитектура, информационная безопасность), непрерывная поставка изменений и промышленный контур. Сильный опыт разработки программ — довожу продукт до рабочего экрана вместе с инженерами.</w:t>
       </w:r>
     </w:p>
     <w:p>
@@ -4505,7 +4480,7 @@
           <w:color w:val="222222"/>
           <w:sz w:val="20"/>
         </w:rPr>
-        <w:t>Управление продуктом  ·  Торговый стол  ·  Разработка с ИИ  ·  Парный арбитраж  ·  Московская биржа  ·  Стратегии возврата к среднему  ·  Живой торговый монитор  ·  Сверка теста и боевой торговли  ·  Рыночные данные  ·  Исследовательский интерфейс  ·  Т-Инвестиции  ·  Разработка программ  ·  Аналитические панели  ·  Управленческая отчётность  ·  Хранилища данных  ·  Непрерывная поставка  ·  Поиск потребностей → метрики → экран → обратная связь  ·  Дорожная карта и бэклог  ·  Запросы к данным  ·  Гибкая разработка</w:t>
+        <w:t>Управление продуктом  ·  Торговый дашборд  ·  Разработка с ИИ  ·  Парный арбитраж  ·  Московская биржа  ·  Живой торговый монитор  ·  Тестирование на истории  ·  Сверка теста и боевой торговли  ·  Т-Инвестиции  ·  Разработка программ  ·  Аналитические панели  ·  Управленческая отчётность  ·  Хранилища данных  ·  Непрерывная поставка  ·  Поиск потребностей → метрики → экран → обратная связь  ·  Дорожная карта и бэклог  ·  Запросы к данным  ·  Гибкая разработка</w:t>
       </w:r>
       <w:r>
         <w:rPr>

</xml_diff>

<commit_message>
Add Qwen-tuned markets resume and separate fuel BA/DWH resume
Co-authored-by: dimonix2019 <dimonix2019@users.noreply.github.com>
</commit_message>
<xml_diff>
--- a/Abramov_DN_resume_PO_markets.docx
+++ b/Abramov_DN_resume_PO_markets.docx
@@ -225,7 +225,7 @@
           <w:sz w:val="24"/>
           <w:lang w:val="ru-RU"/>
         </w:rPr>
-        <w:t>Менеджер продукта аналитических и торговых систем (фондовый рынок)</w:t>
+        <w:t>Менеджер продукта аналитических и торговых систем (фондовый рынок / финтех)</w:t>
       </w:r>
       <w:r>
         <w:rPr>
@@ -256,48 +256,43 @@
     <w:p/>
     <w:p>
       <w:r>
-        <w:t>Проекты</w:t>
+        <w:t>Обо мне</w:t>
       </w:r>
     </w:p>
     <w:p>
       <w:r>
-        <w:t>2024 — настоящее время</w:t>
+        <w:t>Менеджер продукта с опытом в Сбере и банке ПСБ: аналитические платформы, управленческая отчётность, хранилища данных и доведение решений до промышленного контура. Гибридный профиль — продукт (потребность → метрики → экран → обратная связь) плюс понимание архитектуры данных, витрин, информационной безопасности и работы с инженерными командами. Практически применяю ИИ в разработке; отдельно развиваю экспертизу по фондовому рынку через собственный торговый дашборд (полный цикл: интерфейс, тест на истории, живая торговля, брокер).</w:t>
       </w:r>
     </w:p>
     <w:p>
       <w:r>
-        <w:t>Личный продукт: торговый дашборд парного арбитража на Московской бирже; разрабатываю самостоятельно с использованием ИИ.</w:t>
-      </w:r>
-    </w:p>
-    <w:p>
-      <w:r>
-        <w:t>• «Торговля»: живой спред, условия входа и выхода, открытая позиция, прогноз результата, история сделок, исполнение через Т-Инвестиции.</w:t>
-      </w:r>
-    </w:p>
-    <w:p>
-      <w:r>
-        <w:t>• «Тестирование»: прогон на истории, сравнение порогов, кривая капитала, таблица сделок.</w:t>
-      </w:r>
-    </w:p>
-    <w:p>
-      <w:r>
-        <w:t>• Сверка теста и боевой торговли; контроль готовности; мобильное приложение-компаньон.</w:t>
+        <w:t>Фокус: понятные аналитические и торговые экраны, проверяемые решения, поставка до рабочего результата.</w:t>
       </w:r>
     </w:p>
     <w:p/>
     <w:p>
       <w:r>
-        <w:t>Обо мне</w:t>
+        <w:t>Проекты</w:t>
       </w:r>
     </w:p>
     <w:p>
       <w:r>
-        <w:t>Менеджер продукта аналитических и торговых систем на фондовом рынке. Самостоятельно с использованием ИИ развиваю торговый дашборд парного арбитража на Московской бирже: торговый экран, тестирование на истории, сверка с боевой торговлей, подключение к брокеру. Корпоративный опыт усиливает продукт: управленческая отчётность и аналитические панели для заказчика, хранилища данных (контуры, витрины, архитектура, информационная безопасность), непрерывная поставка изменений и промышленный контур. Сильный опыт разработки программ — довожу продукт до рабочего экрана вместе с инженерами.</w:t>
+        <w:t>2024 — настоящее время</w:t>
       </w:r>
     </w:p>
     <w:p>
       <w:r>
-        <w:t>Самостоятельно веду продукт от гипотезы до поставки; работаю с командой и заинтересованными сторонами; фокус на понятном торговом столе, проверяемых решениях и видимом результате.</w:t>
+        <w:t>Личный продукт: торговый дашборд парного арбитража на Московской бирже (разработка с использованием ИИ).</w:t>
+      </w:r>
+    </w:p>
+    <w:p>
+      <w:r>
+        <w:t>Самостоятельно собрал полный цикл продукта: торговый интерфейс, тестирование на истории, живая торговля, сверка теста с боем, подключение к Т-Инвестициям. Навыки: рыночные данные, риск-параметры (плечо, фиксация прибыли, издержки), мониторинг сделок, надёжность контура исполнения.</w:t>
+      </w:r>
+    </w:p>
+    <w:p>
+      <w:r>
+        <w:t>• Функции: живой спред и условия входа/выхода, открытая позиция и прогноз результата, история сделок; прогон на истории и сравнение параметров; сверка сигналов теста и боевой торговли; мобильный компаньон.</w:t>
       </w:r>
     </w:p>
     <w:p/>
@@ -448,7 +443,7 @@
     </w:p>
     <w:p>
       <w:r>
-        <w:t>Корпоративный опыт — управленческая отчётность и аналитика, хранилища данных (контуры, витрины, архитектура, информационная безопасность), непрерывная поставка изменений и промышленный контур для заказчика.</w:t>
+        <w:t>Корпоративный опыт — управленческая отчётность и BI, хранилища данных, промышленная поставка для заказчика.</w:t>
       </w:r>
     </w:p>
     <w:p>
@@ -607,7 +602,7 @@
           <w:sz w:val="21"/>
           <w:lang w:val="ru-RU"/>
         </w:rPr>
-        <w:t>Технический руководитель проекта хранилища данных</w:t>
+        <w:t xml:space="preserve">Технический руководитель проекта </w:t>
       </w:r>
       <w:r>
         <w:rPr>
@@ -616,6 +611,7 @@
           <w:color w:val="222222"/>
           <w:sz w:val="21"/>
         </w:rPr>
+        <w:t>DWH</w:t>
       </w:r>
     </w:p>
     <w:p>
@@ -648,74 +644,83 @@
           <w:sz w:val="20"/>
           <w:lang w:val="ru-RU"/>
         </w:rPr>
-        <w:t>Создание хранилища данных на открытых технологиях: архитектура, инфраструктура, контуры загрузки, витрины; затем подключение аналитической отчётности. Выстроена непрерывная поставка изменений для поставки изменений по контурам хранилища.</w:t>
-      </w:r>
-      <w:r>
-        <w:rPr>
-          <w:rFonts w:ascii="Arial" w:eastAsia="Arial" w:hAnsi="Arial"/>
-          <w:color w:val="222222"/>
-          <w:sz w:val="20"/>
-        </w:rPr>
-      </w:r>
-      <w:r>
-        <w:rPr>
-          <w:rFonts w:ascii="Arial" w:eastAsia="Arial" w:hAnsi="Arial"/>
-          <w:color w:val="222222"/>
-          <w:sz w:val="20"/>
-          <w:lang w:val="ru-RU"/>
-        </w:rPr>
-      </w:r>
-      <w:r>
-        <w:rPr>
-          <w:rFonts w:ascii="Arial" w:eastAsia="Arial" w:hAnsi="Arial"/>
-          <w:color w:val="222222"/>
-          <w:sz w:val="20"/>
-        </w:rPr>
-      </w:r>
-      <w:r>
-        <w:rPr>
-          <w:rFonts w:ascii="Arial" w:eastAsia="Arial" w:hAnsi="Arial"/>
-          <w:color w:val="222222"/>
-          <w:sz w:val="20"/>
-          <w:lang w:val="ru-RU"/>
-        </w:rPr>
-      </w:r>
-      <w:r>
-        <w:rPr>
-          <w:rFonts w:ascii="Arial" w:eastAsia="Arial" w:hAnsi="Arial"/>
-          <w:color w:val="222222"/>
-          <w:sz w:val="20"/>
-        </w:rPr>
-      </w:r>
-      <w:r>
-        <w:rPr>
-          <w:rFonts w:ascii="Arial" w:eastAsia="Arial" w:hAnsi="Arial"/>
-          <w:color w:val="222222"/>
-          <w:sz w:val="20"/>
-          <w:lang w:val="ru-RU"/>
-        </w:rPr>
-      </w:r>
-      <w:r>
-        <w:rPr>
-          <w:rFonts w:ascii="Arial" w:eastAsia="Arial" w:hAnsi="Arial"/>
-          <w:color w:val="222222"/>
-          <w:sz w:val="20"/>
-        </w:rPr>
-      </w:r>
-      <w:r>
-        <w:rPr>
-          <w:rFonts w:ascii="Arial" w:eastAsia="Arial" w:hAnsi="Arial"/>
-          <w:color w:val="222222"/>
-          <w:sz w:val="20"/>
-          <w:lang w:val="ru-RU"/>
-        </w:rPr>
-      </w:r>
-      <w:r>
-        <w:rPr>
-          <w:rFonts w:ascii="Arial" w:eastAsia="Arial" w:hAnsi="Arial"/>
-          <w:color w:val="222222"/>
-          <w:sz w:val="20"/>
-        </w:rPr>
+        <w:t xml:space="preserve">Создание </w:t>
+      </w:r>
+      <w:r>
+        <w:rPr>
+          <w:rFonts w:ascii="Arial" w:eastAsia="Arial" w:hAnsi="Arial"/>
+          <w:color w:val="222222"/>
+          <w:sz w:val="20"/>
+        </w:rPr>
+        <w:t>DWH</w:t>
+      </w:r>
+      <w:r>
+        <w:rPr>
+          <w:rFonts w:ascii="Arial" w:eastAsia="Arial" w:hAnsi="Arial"/>
+          <w:color w:val="222222"/>
+          <w:sz w:val="20"/>
+          <w:lang w:val="ru-RU"/>
+        </w:rPr>
+        <w:t xml:space="preserve"> на </w:t>
+      </w:r>
+      <w:r>
+        <w:rPr>
+          <w:rFonts w:ascii="Arial" w:eastAsia="Arial" w:hAnsi="Arial"/>
+          <w:color w:val="222222"/>
+          <w:sz w:val="20"/>
+        </w:rPr>
+        <w:t>open</w:t>
+      </w:r>
+      <w:r>
+        <w:rPr>
+          <w:rFonts w:ascii="Arial" w:eastAsia="Arial" w:hAnsi="Arial"/>
+          <w:color w:val="222222"/>
+          <w:sz w:val="20"/>
+          <w:lang w:val="ru-RU"/>
+        </w:rPr>
+        <w:t>-</w:t>
+      </w:r>
+      <w:r>
+        <w:rPr>
+          <w:rFonts w:ascii="Arial" w:eastAsia="Arial" w:hAnsi="Arial"/>
+          <w:color w:val="222222"/>
+          <w:sz w:val="20"/>
+        </w:rPr>
+        <w:t>source</w:t>
+      </w:r>
+      <w:r>
+        <w:rPr>
+          <w:rFonts w:ascii="Arial" w:eastAsia="Arial" w:hAnsi="Arial"/>
+          <w:color w:val="222222"/>
+          <w:sz w:val="20"/>
+          <w:lang w:val="ru-RU"/>
+        </w:rPr>
+        <w:t xml:space="preserve"> стеке: архитектура, инфраструктура, контуры загрузки, витрины; затем подключение </w:t>
+      </w:r>
+      <w:r>
+        <w:rPr>
+          <w:rFonts w:ascii="Arial" w:eastAsia="Arial" w:hAnsi="Arial"/>
+          <w:color w:val="222222"/>
+          <w:sz w:val="20"/>
+        </w:rPr>
+        <w:t>BI</w:t>
+      </w:r>
+      <w:r>
+        <w:rPr>
+          <w:rFonts w:ascii="Arial" w:eastAsia="Arial" w:hAnsi="Arial"/>
+          <w:color w:val="222222"/>
+          <w:sz w:val="20"/>
+          <w:lang w:val="ru-RU"/>
+        </w:rPr>
+        <w:t xml:space="preserve">. </w:t>
+      </w:r>
+      <w:r>
+        <w:rPr>
+          <w:rFonts w:ascii="Arial" w:eastAsia="Arial" w:hAnsi="Arial"/>
+          <w:color w:val="222222"/>
+          <w:sz w:val="20"/>
+        </w:rPr>
+        <w:t>Выстроен CI/CD для поставки изменений по контурам хранилища.</w:t>
       </w:r>
     </w:p>
     <w:p>
@@ -769,7 +774,7 @@
           <w:sz w:val="20"/>
           <w:lang w:val="ru-RU"/>
         </w:rPr>
-        <w:t>Финансы и закупки проекта; контроль бюджета, рисков и состава работ; защита статуса перед бизнесом.</w:t>
+        <w:t xml:space="preserve">Финансы и закупки проекта; контроль бюджета, рисков и </w:t>
       </w:r>
       <w:proofErr w:type="spellStart"/>
       <w:r>
@@ -779,6 +784,7 @@
           <w:sz w:val="20"/>
           <w:lang w:val="ru-RU"/>
         </w:rPr>
+        <w:t>скоупа</w:t>
       </w:r>
       <w:proofErr w:type="spellEnd"/>
       <w:r>
@@ -788,6 +794,7 @@
           <w:sz w:val="20"/>
           <w:lang w:val="ru-RU"/>
         </w:rPr>
+        <w:t>; защита статуса перед бизнесом.</w:t>
       </w:r>
     </w:p>
     <w:p>
@@ -805,82 +812,92 @@
           <w:sz w:val="20"/>
           <w:lang w:val="ru-RU"/>
         </w:rPr>
-        <w:t>Согласованы ключевые документы (цели, дорожная карта, концептуальный дизайн, БТ, ТЗ) с ИТ, ИБ и бизнесом; совместно со Scrum-мастером внедрены Agile-процессы; организована непрерывная поставка изменений.</w:t>
-      </w:r>
-      <w:r>
-        <w:rPr>
-          <w:rFonts w:ascii="Arial" w:eastAsia="Arial" w:hAnsi="Arial"/>
-          <w:color w:val="222222"/>
-          <w:sz w:val="20"/>
-        </w:rPr>
-      </w:r>
-      <w:r>
-        <w:rPr>
-          <w:rFonts w:ascii="Arial" w:eastAsia="Arial" w:hAnsi="Arial"/>
-          <w:color w:val="222222"/>
-          <w:sz w:val="20"/>
-          <w:lang w:val="ru-RU"/>
-        </w:rPr>
-      </w:r>
-      <w:r>
-        <w:rPr>
-          <w:rFonts w:ascii="Arial" w:eastAsia="Arial" w:hAnsi="Arial"/>
-          <w:color w:val="222222"/>
-          <w:sz w:val="20"/>
-        </w:rPr>
-      </w:r>
-      <w:r>
-        <w:rPr>
-          <w:rFonts w:ascii="Arial" w:eastAsia="Arial" w:hAnsi="Arial"/>
-          <w:color w:val="222222"/>
-          <w:sz w:val="20"/>
-          <w:lang w:val="ru-RU"/>
-        </w:rPr>
-      </w:r>
-      <w:r>
-        <w:rPr>
-          <w:rFonts w:ascii="Arial" w:eastAsia="Arial" w:hAnsi="Arial"/>
-          <w:color w:val="222222"/>
-          <w:sz w:val="20"/>
-        </w:rPr>
-      </w:r>
-      <w:r>
-        <w:rPr>
-          <w:rFonts w:ascii="Arial" w:eastAsia="Arial" w:hAnsi="Arial"/>
-          <w:color w:val="222222"/>
-          <w:sz w:val="20"/>
-          <w:lang w:val="ru-RU"/>
-        </w:rPr>
-      </w:r>
-      <w:r>
-        <w:rPr>
-          <w:rFonts w:ascii="Arial" w:eastAsia="Arial" w:hAnsi="Arial"/>
-          <w:color w:val="222222"/>
-          <w:sz w:val="20"/>
-        </w:rPr>
-      </w:r>
-      <w:r>
-        <w:rPr>
-          <w:rFonts w:ascii="Arial" w:eastAsia="Arial" w:hAnsi="Arial"/>
-          <w:color w:val="222222"/>
-          <w:sz w:val="20"/>
-          <w:lang w:val="ru-RU"/>
-        </w:rPr>
-      </w:r>
-      <w:r>
-        <w:rPr>
-          <w:rFonts w:ascii="Arial" w:eastAsia="Arial" w:hAnsi="Arial"/>
-          <w:color w:val="222222"/>
-          <w:sz w:val="20"/>
-        </w:rPr>
-      </w:r>
-      <w:r>
-        <w:rPr>
-          <w:rFonts w:ascii="Arial" w:eastAsia="Arial" w:hAnsi="Arial"/>
-          <w:color w:val="222222"/>
-          <w:sz w:val="20"/>
-          <w:lang w:val="ru-RU"/>
-        </w:rPr>
+        <w:t xml:space="preserve">Согласованы ключевые документы (цели, </w:t>
+      </w:r>
+      <w:r>
+        <w:rPr>
+          <w:rFonts w:ascii="Arial" w:eastAsia="Arial" w:hAnsi="Arial"/>
+          <w:color w:val="222222"/>
+          <w:sz w:val="20"/>
+        </w:rPr>
+        <w:t>RoadMap</w:t>
+      </w:r>
+      <w:r>
+        <w:rPr>
+          <w:rFonts w:ascii="Arial" w:eastAsia="Arial" w:hAnsi="Arial"/>
+          <w:color w:val="222222"/>
+          <w:sz w:val="20"/>
+          <w:lang w:val="ru-RU"/>
+        </w:rPr>
+        <w:t xml:space="preserve">, концептуальный дизайн, БТ, ТЗ) с ИТ, ИБ и бизнесом; совместно со </w:t>
+      </w:r>
+      <w:r>
+        <w:rPr>
+          <w:rFonts w:ascii="Arial" w:eastAsia="Arial" w:hAnsi="Arial"/>
+          <w:color w:val="222222"/>
+          <w:sz w:val="20"/>
+        </w:rPr>
+        <w:t>Scrum</w:t>
+      </w:r>
+      <w:r>
+        <w:rPr>
+          <w:rFonts w:ascii="Arial" w:eastAsia="Arial" w:hAnsi="Arial"/>
+          <w:color w:val="222222"/>
+          <w:sz w:val="20"/>
+          <w:lang w:val="ru-RU"/>
+        </w:rPr>
+        <w:t xml:space="preserve">-мастером внедрены </w:t>
+      </w:r>
+      <w:r>
+        <w:rPr>
+          <w:rFonts w:ascii="Arial" w:eastAsia="Arial" w:hAnsi="Arial"/>
+          <w:color w:val="222222"/>
+          <w:sz w:val="20"/>
+        </w:rPr>
+        <w:t>Agile</w:t>
+      </w:r>
+      <w:r>
+        <w:rPr>
+          <w:rFonts w:ascii="Arial" w:eastAsia="Arial" w:hAnsi="Arial"/>
+          <w:color w:val="222222"/>
+          <w:sz w:val="20"/>
+          <w:lang w:val="ru-RU"/>
+        </w:rPr>
+        <w:t xml:space="preserve">-процессы; организован </w:t>
+      </w:r>
+      <w:r>
+        <w:rPr>
+          <w:rFonts w:ascii="Arial" w:eastAsia="Arial" w:hAnsi="Arial"/>
+          <w:color w:val="222222"/>
+          <w:sz w:val="20"/>
+        </w:rPr>
+        <w:t>CI</w:t>
+      </w:r>
+      <w:r>
+        <w:rPr>
+          <w:rFonts w:ascii="Arial" w:eastAsia="Arial" w:hAnsi="Arial"/>
+          <w:color w:val="222222"/>
+          <w:sz w:val="20"/>
+          <w:lang w:val="ru-RU"/>
+        </w:rPr>
+        <w:t>/</w:t>
+      </w:r>
+      <w:r>
+        <w:rPr>
+          <w:rFonts w:ascii="Arial" w:eastAsia="Arial" w:hAnsi="Arial"/>
+          <w:color w:val="222222"/>
+          <w:sz w:val="20"/>
+        </w:rPr>
+        <w:t>CD</w:t>
+      </w:r>
+      <w:r>
+        <w:rPr>
+          <w:rFonts w:ascii="Arial" w:eastAsia="Arial" w:hAnsi="Arial"/>
+          <w:color w:val="222222"/>
+          <w:sz w:val="20"/>
+          <w:lang w:val="ru-RU"/>
+        </w:rPr>
+        <w:t>.</w:t>
       </w:r>
     </w:p>
     <w:p>
@@ -923,37 +940,41 @@
           <w:sz w:val="20"/>
           <w:lang w:val="ru-RU"/>
         </w:rPr>
-        <w:t>Техническое руководство проектом создания хранилища данных: архитектура, инфраструктура, контуры загрузки, витрины; подключение аналитической отчётности после готовности контуров хранилища.</w:t>
-      </w:r>
-      <w:r>
-        <w:rPr>
-          <w:rFonts w:ascii="Arial" w:eastAsia="Arial" w:hAnsi="Arial"/>
-          <w:color w:val="222222"/>
-          <w:sz w:val="20"/>
-        </w:rPr>
-      </w:r>
-      <w:r>
-        <w:rPr>
-          <w:rFonts w:ascii="Arial" w:eastAsia="Arial" w:hAnsi="Arial"/>
-          <w:color w:val="222222"/>
-          <w:sz w:val="20"/>
-          <w:lang w:val="ru-RU"/>
-        </w:rPr>
-      </w:r>
-      <w:r>
-        <w:rPr>
-          <w:rFonts w:ascii="Arial" w:eastAsia="Arial" w:hAnsi="Arial"/>
-          <w:color w:val="222222"/>
-          <w:sz w:val="20"/>
-        </w:rPr>
-      </w:r>
-      <w:r>
-        <w:rPr>
-          <w:rFonts w:ascii="Arial" w:eastAsia="Arial" w:hAnsi="Arial"/>
-          <w:color w:val="222222"/>
-          <w:sz w:val="20"/>
-          <w:lang w:val="ru-RU"/>
-        </w:rPr>
+        <w:t xml:space="preserve">Техническое руководство проектом создания </w:t>
+      </w:r>
+      <w:r>
+        <w:rPr>
+          <w:rFonts w:ascii="Arial" w:eastAsia="Arial" w:hAnsi="Arial"/>
+          <w:color w:val="222222"/>
+          <w:sz w:val="20"/>
+        </w:rPr>
+        <w:t>DWH</w:t>
+      </w:r>
+      <w:r>
+        <w:rPr>
+          <w:rFonts w:ascii="Arial" w:eastAsia="Arial" w:hAnsi="Arial"/>
+          <w:color w:val="222222"/>
+          <w:sz w:val="20"/>
+          <w:lang w:val="ru-RU"/>
+        </w:rPr>
+        <w:t xml:space="preserve">: архитектура, инфраструктура, контуры загрузки, витрины; подключение </w:t>
+      </w:r>
+      <w:r>
+        <w:rPr>
+          <w:rFonts w:ascii="Arial" w:eastAsia="Arial" w:hAnsi="Arial"/>
+          <w:color w:val="222222"/>
+          <w:sz w:val="20"/>
+        </w:rPr>
+        <w:t>BI</w:t>
+      </w:r>
+      <w:r>
+        <w:rPr>
+          <w:rFonts w:ascii="Arial" w:eastAsia="Arial" w:hAnsi="Arial"/>
+          <w:color w:val="222222"/>
+          <w:sz w:val="20"/>
+          <w:lang w:val="ru-RU"/>
+        </w:rPr>
+        <w:t xml:space="preserve"> после готовности контуров хранилища.</w:t>
       </w:r>
     </w:p>
     <w:p>
@@ -1025,52 +1046,58 @@
           <w:sz w:val="20"/>
           <w:lang w:val="ru-RU"/>
         </w:rPr>
-        <w:t>Контроль состава работ, рисков и сроков; защита проекта перед бизнесом; дорожная карта и проектные документы; развитие непрерывной поставки изменений.</w:t>
-      </w:r>
-      <w:r>
-        <w:rPr>
-          <w:rFonts w:ascii="Arial" w:eastAsia="Arial" w:hAnsi="Arial"/>
-          <w:color w:val="222222"/>
-          <w:sz w:val="20"/>
-        </w:rPr>
-      </w:r>
-      <w:r>
-        <w:rPr>
-          <w:rFonts w:ascii="Arial" w:eastAsia="Arial" w:hAnsi="Arial"/>
-          <w:color w:val="222222"/>
-          <w:sz w:val="20"/>
-          <w:lang w:val="ru-RU"/>
-        </w:rPr>
-      </w:r>
-      <w:r>
-        <w:rPr>
-          <w:rFonts w:ascii="Arial" w:eastAsia="Arial" w:hAnsi="Arial"/>
-          <w:color w:val="222222"/>
-          <w:sz w:val="20"/>
-        </w:rPr>
-      </w:r>
-      <w:r>
-        <w:rPr>
-          <w:rFonts w:ascii="Arial" w:eastAsia="Arial" w:hAnsi="Arial"/>
-          <w:color w:val="222222"/>
-          <w:sz w:val="20"/>
-          <w:lang w:val="ru-RU"/>
-        </w:rPr>
-      </w:r>
-      <w:r>
-        <w:rPr>
-          <w:rFonts w:ascii="Arial" w:eastAsia="Arial" w:hAnsi="Arial"/>
-          <w:color w:val="222222"/>
-          <w:sz w:val="20"/>
-        </w:rPr>
-      </w:r>
-      <w:r>
-        <w:rPr>
-          <w:rFonts w:ascii="Arial" w:eastAsia="Arial" w:hAnsi="Arial"/>
-          <w:color w:val="222222"/>
-          <w:sz w:val="20"/>
-          <w:lang w:val="ru-RU"/>
-        </w:rPr>
+        <w:t xml:space="preserve">Контроль скоупа, рисков и сроков; защита проекта перед бизнесом; </w:t>
+      </w:r>
+      <w:r>
+        <w:rPr>
+          <w:rFonts w:ascii="Arial" w:eastAsia="Arial" w:hAnsi="Arial"/>
+          <w:color w:val="222222"/>
+          <w:sz w:val="20"/>
+        </w:rPr>
+        <w:t>RoadMap</w:t>
+      </w:r>
+      <w:r>
+        <w:rPr>
+          <w:rFonts w:ascii="Arial" w:eastAsia="Arial" w:hAnsi="Arial"/>
+          <w:color w:val="222222"/>
+          <w:sz w:val="20"/>
+          <w:lang w:val="ru-RU"/>
+        </w:rPr>
+        <w:t xml:space="preserve"> и проектные документы; развитие </w:t>
+      </w:r>
+      <w:r>
+        <w:rPr>
+          <w:rFonts w:ascii="Arial" w:eastAsia="Arial" w:hAnsi="Arial"/>
+          <w:color w:val="222222"/>
+          <w:sz w:val="20"/>
+        </w:rPr>
+        <w:t>CI</w:t>
+      </w:r>
+      <w:r>
+        <w:rPr>
+          <w:rFonts w:ascii="Arial" w:eastAsia="Arial" w:hAnsi="Arial"/>
+          <w:color w:val="222222"/>
+          <w:sz w:val="20"/>
+          <w:lang w:val="ru-RU"/>
+        </w:rPr>
+        <w:t>/</w:t>
+      </w:r>
+      <w:r>
+        <w:rPr>
+          <w:rFonts w:ascii="Arial" w:eastAsia="Arial" w:hAnsi="Arial"/>
+          <w:color w:val="222222"/>
+          <w:sz w:val="20"/>
+        </w:rPr>
+        <w:t>CD</w:t>
+      </w:r>
+      <w:r>
+        <w:rPr>
+          <w:rFonts w:ascii="Arial" w:eastAsia="Arial" w:hAnsi="Arial"/>
+          <w:color w:val="222222"/>
+          <w:sz w:val="20"/>
+          <w:lang w:val="ru-RU"/>
+        </w:rPr>
+        <w:t>.</w:t>
       </w:r>
     </w:p>
     <w:p>
@@ -3381,7 +3408,7 @@
           <w:sz w:val="20"/>
           <w:lang w:val="ru-RU"/>
         </w:rPr>
-        <w:t>2025  Аренадата. Архитектура хранилищ данных</w:t>
+        <w:t xml:space="preserve">2025  </w:t>
       </w:r>
       <w:r>
         <w:rPr>
@@ -3391,6 +3418,7 @@
           <w:sz w:val="21"/>
           <w:lang w:val="ru-RU"/>
         </w:rPr>
+        <w:t>Аренадата</w:t>
       </w:r>
       <w:proofErr w:type="gramEnd"/>
       <w:r>
@@ -3401,6 +3429,7 @@
           <w:sz w:val="21"/>
           <w:lang w:val="ru-RU"/>
         </w:rPr>
+        <w:t xml:space="preserve">. Архитектура </w:t>
       </w:r>
       <w:r>
         <w:rPr>
@@ -3409,6 +3438,7 @@
           <w:color w:val="222222"/>
           <w:sz w:val="21"/>
         </w:rPr>
+        <w:t>DWH</w:t>
       </w:r>
     </w:p>
     <w:p>
@@ -3425,7 +3455,7 @@
           <w:sz w:val="19"/>
           <w:lang w:val="ru-RU"/>
         </w:rPr>
-        <w:t>Аренадата, Архитектура хранилищ данных</w:t>
+        <w:t xml:space="preserve">Аренадата, Архитектура </w:t>
       </w:r>
       <w:r>
         <w:rPr>
@@ -3433,6 +3463,7 @@
           <w:color w:val="666666"/>
           <w:sz w:val="19"/>
         </w:rPr>
+        <w:t>DWH</w:t>
       </w:r>
     </w:p>
     <w:p>
@@ -4480,7 +4511,7 @@
           <w:color w:val="222222"/>
           <w:sz w:val="20"/>
         </w:rPr>
-        <w:t>Управление продуктом  ·  Торговый дашборд  ·  Разработка с ИИ  ·  Парный арбитраж  ·  Московская биржа  ·  Живой торговый монитор  ·  Тестирование на истории  ·  Сверка теста и боевой торговли  ·  Т-Инвестиции  ·  Разработка программ  ·  Аналитические панели  ·  Управленческая отчётность  ·  Хранилища данных  ·  Непрерывная поставка  ·  Поиск потребностей → метрики → экран → обратная связь  ·  Дорожная карта и бэклог  ·  Запросы к данным  ·  Гибкая разработка</w:t>
+        <w:t>Продукт: управление продуктом · дорожная карта и бэклог · потребность → метрики → экран → обратная связь · гибкая разработка. Данные и аналитика: хранилища данных · витрины · управленческая отчётность · BI / дашборды (Qlik, Форсайт) · запросы к данным. Технологии: разработка с ИИ · интеграции / API · непрерывная поставка · информационная безопасность. Рынки: торговый дашборд · Московская биржа · Т-Инвестиции · мониторинг сделок и издержек.</w:t>
       </w:r>
       <w:r>
         <w:rPr>
@@ -4832,6 +4863,24 @@
           <w:sz w:val="20"/>
         </w:rPr>
         <w:t>C</w:t>
+      </w:r>
+    </w:p>
+    <w:p>
+      <w:pPr>
+        <w:spacing w:after="160" w:line="252" w:lineRule="auto"/>
+        <w:rPr>
+          <w:lang w:val="ru-RU"/>
+        </w:rPr>
+      </w:pPr>
+      <w:r>
+        <w:rPr>
+          <w:rFonts w:ascii="Arial" w:eastAsia="Arial" w:hAnsi="Arial"/>
+          <w:color w:val="222222"/>
+          <w:sz w:val="21"/>
+          <w:lang w:val="ru-RU"/>
+        </w:rPr>
+        <w:lastRenderedPageBreak/>
+        <w:t>Коммуникабельный, ответственный, самостоятельный. Быстро обучаюсь, постоянно повышаю профессиональный уровень. Умение работать с людьми и доводить продукт до видимого результата для пользователей.</w:t>
       </w:r>
     </w:p>
     <w:sectPr>

</xml_diff>